<commit_message>
feat(docs): packege and docs
</commit_message>
<xml_diff>
--- a/docs/MultiPag_Estimativa_Pontos_de_Funcao.docx
+++ b/docs/MultiPag_Estimativa_Pontos_de_Funcao.docx
@@ -12460,4670 +12460,6 @@
           <w:szCs w:val="21"/>
         </w:rPr>
         <w:t xml:space="preserve"/>
-      </w:r>
-    </w:p>
-    <w:p>
-      <w:pPr>
-        <w:pStyle w:val="Heading1"/>
-        <w:keepNext/>
-        <w:pageBreakBefore/>
-        <w:spacing w:after="160" w:before="0"/>
-      </w:pPr>
-      <w:r>
-        <w:rPr>
-          <w:rFonts w:ascii="Arial" w:cs="Arial" w:eastAsia="Arial" w:hAnsi="Arial"/>
-          <w:b/>
-          <w:bCs/>
-          <w:color w:val="1F3864"/>
-          <w:sz w:val="30"/>
-          <w:szCs w:val="30"/>
-        </w:rPr>
-        <w:t xml:space="preserve">6. Cálculo dos pontos de função</w:t>
-      </w:r>
-    </w:p>
-    <w:p>
-      <w:pPr>
-        <w:pStyle w:val="Heading2"/>
-        <w:keepNext/>
-        <w:spacing w:after="80" w:before="200"/>
-      </w:pPr>
-      <w:r>
-        <w:rPr>
-          <w:rFonts w:ascii="Arial" w:cs="Arial" w:eastAsia="Arial" w:hAnsi="Arial"/>
-          <w:b/>
-          <w:bCs/>
-          <w:color w:val="2F5496"/>
-          <w:sz w:val="24"/>
-          <w:szCs w:val="24"/>
-        </w:rPr>
-        <w:t xml:space="preserve">6.1 Pontos de função brutos (PFB)</w:t>
-      </w:r>
-    </w:p>
-    <w:tbl>
-      <w:tblPr>
-        <w:tblW w:type="dxa" w:w="9638"/>
-        <w:tblBorders>
-          <w:top w:val="single" w:color="auto" w:sz="4"/>
-          <w:left w:val="single" w:color="auto" w:sz="4"/>
-          <w:bottom w:val="single" w:color="auto" w:sz="4"/>
-          <w:right w:val="single" w:color="auto" w:sz="4"/>
-          <w:insideH w:val="single" w:color="auto" w:sz="4"/>
-          <w:insideV w:val="single" w:color="auto" w:sz="4"/>
-        </w:tblBorders>
-      </w:tblPr>
-      <w:tblGrid>
-        <w:gridCol w:w="2600"/>
-        <w:gridCol w:w="1500"/>
-        <w:gridCol w:w="1500"/>
-        <w:gridCol w:w="1500"/>
-        <w:gridCol w:w="1300"/>
-        <w:gridCol w:w="1238"/>
-      </w:tblGrid>
-      <w:tr>
-        <w:trPr>
-          <w:cantSplit/>
-          <w:tblHeader/>
-        </w:trPr>
-        <w:tc>
-          <w:tcPr>
-            <w:tcW w:type="dxa" w:w="2600"/>
-            <w:tcBorders>
-              <w:top w:val="single" w:color="A6A6A6" w:sz="4"/>
-              <w:left w:val="single" w:color="A6A6A6" w:sz="4"/>
-              <w:bottom w:val="single" w:color="A6A6A6" w:sz="4"/>
-              <w:right w:val="single" w:color="A6A6A6" w:sz="4"/>
-            </w:tcBorders>
-            <w:shd w:fill="E7E6E6" w:color="auto" w:val="clear"/>
-            <w:tcMar>
-              <w:top w:type="dxa" w:w="45"/>
-              <w:left w:type="dxa" w:w="90"/>
-              <w:bottom w:type="dxa" w:w="45"/>
-              <w:right w:type="dxa" w:w="90"/>
-            </w:tcMar>
-            <w:vAlign w:val="center"/>
-          </w:tcPr>
-          <w:p>
-            <w:pPr>
-              <w:keepNext/>
-              <w:spacing w:after="0" w:line="250"/>
-              <w:jc w:val="left"/>
-            </w:pPr>
-            <w:r>
-              <w:rPr>
-                <w:rFonts w:ascii="Arial" w:cs="Arial" w:eastAsia="Arial" w:hAnsi="Arial"/>
-                <w:b/>
-                <w:bCs/>
-                <w:sz w:val="18"/>
-                <w:szCs w:val="18"/>
-              </w:rPr>
-              <w:t xml:space="preserve">Tipo de função</w:t>
-            </w:r>
-          </w:p>
-        </w:tc>
-        <w:tc>
-          <w:tcPr>
-            <w:tcW w:type="dxa" w:w="1500"/>
-            <w:tcBorders>
-              <w:top w:val="single" w:color="A6A6A6" w:sz="4"/>
-              <w:left w:val="single" w:color="A6A6A6" w:sz="4"/>
-              <w:bottom w:val="single" w:color="A6A6A6" w:sz="4"/>
-              <w:right w:val="single" w:color="A6A6A6" w:sz="4"/>
-            </w:tcBorders>
-            <w:shd w:fill="E7E6E6" w:color="auto" w:val="clear"/>
-            <w:tcMar>
-              <w:top w:type="dxa" w:w="45"/>
-              <w:left w:type="dxa" w:w="90"/>
-              <w:bottom w:type="dxa" w:w="45"/>
-              <w:right w:type="dxa" w:w="90"/>
-            </w:tcMar>
-            <w:vAlign w:val="center"/>
-          </w:tcPr>
-          <w:p>
-            <w:pPr>
-              <w:keepNext/>
-              <w:spacing w:after="0" w:line="250"/>
-              <w:jc w:val="center"/>
-            </w:pPr>
-            <w:r>
-              <w:rPr>
-                <w:rFonts w:ascii="Arial" w:cs="Arial" w:eastAsia="Arial" w:hAnsi="Arial"/>
-                <w:b/>
-                <w:bCs/>
-                <w:sz w:val="18"/>
-                <w:szCs w:val="18"/>
-              </w:rPr>
-              <w:t xml:space="preserve">Simples</w:t>
-            </w:r>
-          </w:p>
-        </w:tc>
-        <w:tc>
-          <w:tcPr>
-            <w:tcW w:type="dxa" w:w="1500"/>
-            <w:tcBorders>
-              <w:top w:val="single" w:color="A6A6A6" w:sz="4"/>
-              <w:left w:val="single" w:color="A6A6A6" w:sz="4"/>
-              <w:bottom w:val="single" w:color="A6A6A6" w:sz="4"/>
-              <w:right w:val="single" w:color="A6A6A6" w:sz="4"/>
-            </w:tcBorders>
-            <w:shd w:fill="E7E6E6" w:color="auto" w:val="clear"/>
-            <w:tcMar>
-              <w:top w:type="dxa" w:w="45"/>
-              <w:left w:type="dxa" w:w="90"/>
-              <w:bottom w:type="dxa" w:w="45"/>
-              <w:right w:type="dxa" w:w="90"/>
-            </w:tcMar>
-            <w:vAlign w:val="center"/>
-          </w:tcPr>
-          <w:p>
-            <w:pPr>
-              <w:keepNext/>
-              <w:spacing w:after="0" w:line="250"/>
-              <w:jc w:val="center"/>
-            </w:pPr>
-            <w:r>
-              <w:rPr>
-                <w:rFonts w:ascii="Arial" w:cs="Arial" w:eastAsia="Arial" w:hAnsi="Arial"/>
-                <w:b/>
-                <w:bCs/>
-                <w:sz w:val="18"/>
-                <w:szCs w:val="18"/>
-              </w:rPr>
-              <w:t xml:space="preserve">Moderado</w:t>
-            </w:r>
-          </w:p>
-        </w:tc>
-        <w:tc>
-          <w:tcPr>
-            <w:tcW w:type="dxa" w:w="1500"/>
-            <w:tcBorders>
-              <w:top w:val="single" w:color="A6A6A6" w:sz="4"/>
-              <w:left w:val="single" w:color="A6A6A6" w:sz="4"/>
-              <w:bottom w:val="single" w:color="A6A6A6" w:sz="4"/>
-              <w:right w:val="single" w:color="A6A6A6" w:sz="4"/>
-            </w:tcBorders>
-            <w:shd w:fill="E7E6E6" w:color="auto" w:val="clear"/>
-            <w:tcMar>
-              <w:top w:type="dxa" w:w="45"/>
-              <w:left w:type="dxa" w:w="90"/>
-              <w:bottom w:type="dxa" w:w="45"/>
-              <w:right w:type="dxa" w:w="90"/>
-            </w:tcMar>
-            <w:vAlign w:val="center"/>
-          </w:tcPr>
-          <w:p>
-            <w:pPr>
-              <w:keepNext/>
-              <w:spacing w:after="0" w:line="250"/>
-              <w:jc w:val="center"/>
-            </w:pPr>
-            <w:r>
-              <w:rPr>
-                <w:rFonts w:ascii="Arial" w:cs="Arial" w:eastAsia="Arial" w:hAnsi="Arial"/>
-                <w:b/>
-                <w:bCs/>
-                <w:sz w:val="18"/>
-                <w:szCs w:val="18"/>
-              </w:rPr>
-              <w:t xml:space="preserve">Complexo</w:t>
-            </w:r>
-          </w:p>
-        </w:tc>
-        <w:tc>
-          <w:tcPr>
-            <w:tcW w:type="dxa" w:w="1300"/>
-            <w:tcBorders>
-              <w:top w:val="single" w:color="A6A6A6" w:sz="4"/>
-              <w:left w:val="single" w:color="A6A6A6" w:sz="4"/>
-              <w:bottom w:val="single" w:color="A6A6A6" w:sz="4"/>
-              <w:right w:val="single" w:color="A6A6A6" w:sz="4"/>
-            </w:tcBorders>
-            <w:shd w:fill="E7E6E6" w:color="auto" w:val="clear"/>
-            <w:tcMar>
-              <w:top w:type="dxa" w:w="45"/>
-              <w:left w:type="dxa" w:w="90"/>
-              <w:bottom w:type="dxa" w:w="45"/>
-              <w:right w:type="dxa" w:w="90"/>
-            </w:tcMar>
-            <w:vAlign w:val="center"/>
-          </w:tcPr>
-          <w:p>
-            <w:pPr>
-              <w:keepNext/>
-              <w:spacing w:after="0" w:line="250"/>
-              <w:jc w:val="center"/>
-            </w:pPr>
-            <w:r>
-              <w:rPr>
-                <w:rFonts w:ascii="Arial" w:cs="Arial" w:eastAsia="Arial" w:hAnsi="Arial"/>
-                <w:b/>
-                <w:bCs/>
-                <w:sz w:val="18"/>
-                <w:szCs w:val="18"/>
-              </w:rPr>
-              <w:t xml:space="preserve">Quantidade</w:t>
-            </w:r>
-          </w:p>
-        </w:tc>
-        <w:tc>
-          <w:tcPr>
-            <w:tcW w:type="dxa" w:w="1238"/>
-            <w:tcBorders>
-              <w:top w:val="single" w:color="A6A6A6" w:sz="4"/>
-              <w:left w:val="single" w:color="A6A6A6" w:sz="4"/>
-              <w:bottom w:val="single" w:color="A6A6A6" w:sz="4"/>
-              <w:right w:val="single" w:color="A6A6A6" w:sz="4"/>
-            </w:tcBorders>
-            <w:shd w:fill="E7E6E6" w:color="auto" w:val="clear"/>
-            <w:tcMar>
-              <w:top w:type="dxa" w:w="45"/>
-              <w:left w:type="dxa" w:w="90"/>
-              <w:bottom w:type="dxa" w:w="45"/>
-              <w:right w:type="dxa" w:w="90"/>
-            </w:tcMar>
-            <w:vAlign w:val="center"/>
-          </w:tcPr>
-          <w:p>
-            <w:pPr>
-              <w:keepNext/>
-              <w:spacing w:after="0" w:line="250"/>
-              <w:jc w:val="center"/>
-            </w:pPr>
-            <w:r>
-              <w:rPr>
-                <w:rFonts w:ascii="Arial" w:cs="Arial" w:eastAsia="Arial" w:hAnsi="Arial"/>
-                <w:b/>
-                <w:bCs/>
-                <w:sz w:val="18"/>
-                <w:szCs w:val="18"/>
-              </w:rPr>
-              <w:t xml:space="preserve">PF</w:t>
-            </w:r>
-          </w:p>
-        </w:tc>
-      </w:tr>
-      <w:tr>
-        <w:trPr>
-          <w:cantSplit/>
-        </w:trPr>
-        <w:tc>
-          <w:tcPr>
-            <w:tcW w:type="dxa" w:w="2600"/>
-            <w:tcBorders>
-              <w:top w:val="single" w:color="A6A6A6" w:sz="4"/>
-              <w:left w:val="single" w:color="A6A6A6" w:sz="4"/>
-              <w:bottom w:val="single" w:color="A6A6A6" w:sz="4"/>
-              <w:right w:val="single" w:color="A6A6A6" w:sz="4"/>
-            </w:tcBorders>
-            <w:tcMar>
-              <w:top w:type="dxa" w:w="45"/>
-              <w:left w:type="dxa" w:w="90"/>
-              <w:bottom w:type="dxa" w:w="45"/>
-              <w:right w:type="dxa" w:w="90"/>
-            </w:tcMar>
-            <w:vAlign w:val="center"/>
-          </w:tcPr>
-          <w:p>
-            <w:pPr>
-              <w:spacing w:after="0" w:line="250"/>
-            </w:pPr>
-            <w:r>
-              <w:rPr>
-                <w:rFonts w:ascii="Arial" w:cs="Arial" w:eastAsia="Arial" w:hAnsi="Arial"/>
-                <w:b/>
-                <w:bCs/>
-                <w:sz w:val="18"/>
-                <w:szCs w:val="18"/>
-              </w:rPr>
-              <w:t xml:space="preserve">ALI</w:t>
-            </w:r>
-          </w:p>
-        </w:tc>
-        <w:tc>
-          <w:tcPr>
-            <w:tcW w:type="dxa" w:w="1500"/>
-            <w:tcBorders>
-              <w:top w:val="single" w:color="A6A6A6" w:sz="4"/>
-              <w:left w:val="single" w:color="A6A6A6" w:sz="4"/>
-              <w:bottom w:val="single" w:color="A6A6A6" w:sz="4"/>
-              <w:right w:val="single" w:color="A6A6A6" w:sz="4"/>
-            </w:tcBorders>
-            <w:tcMar>
-              <w:top w:type="dxa" w:w="45"/>
-              <w:left w:type="dxa" w:w="90"/>
-              <w:bottom w:type="dxa" w:w="45"/>
-              <w:right w:type="dxa" w:w="90"/>
-            </w:tcMar>
-            <w:vAlign w:val="center"/>
-          </w:tcPr>
-          <w:p>
-            <w:pPr>
-              <w:spacing w:after="0" w:line="250"/>
-              <w:jc w:val="center"/>
-            </w:pPr>
-            <w:r>
-              <w:rPr>
-                <w:rFonts w:ascii="Arial" w:cs="Arial" w:eastAsia="Arial" w:hAnsi="Arial"/>
-                <w:sz w:val="18"/>
-                <w:szCs w:val="18"/>
-              </w:rPr>
-              <w:t xml:space="preserve">6 × 7 = 42</w:t>
-            </w:r>
-          </w:p>
-        </w:tc>
-        <w:tc>
-          <w:tcPr>
-            <w:tcW w:type="dxa" w:w="1500"/>
-            <w:tcBorders>
-              <w:top w:val="single" w:color="A6A6A6" w:sz="4"/>
-              <w:left w:val="single" w:color="A6A6A6" w:sz="4"/>
-              <w:bottom w:val="single" w:color="A6A6A6" w:sz="4"/>
-              <w:right w:val="single" w:color="A6A6A6" w:sz="4"/>
-            </w:tcBorders>
-            <w:tcMar>
-              <w:top w:type="dxa" w:w="45"/>
-              <w:left w:type="dxa" w:w="90"/>
-              <w:bottom w:type="dxa" w:w="45"/>
-              <w:right w:type="dxa" w:w="90"/>
-            </w:tcMar>
-            <w:vAlign w:val="center"/>
-          </w:tcPr>
-          <w:p>
-            <w:pPr>
-              <w:spacing w:after="0" w:line="250"/>
-              <w:jc w:val="center"/>
-            </w:pPr>
-            <w:r>
-              <w:rPr>
-                <w:rFonts w:ascii="Arial" w:cs="Arial" w:eastAsia="Arial" w:hAnsi="Arial"/>
-                <w:sz w:val="18"/>
-                <w:szCs w:val="18"/>
-              </w:rPr>
-              <w:t xml:space="preserve">0 × 10 = 0</w:t>
-            </w:r>
-          </w:p>
-        </w:tc>
-        <w:tc>
-          <w:tcPr>
-            <w:tcW w:type="dxa" w:w="1500"/>
-            <w:tcBorders>
-              <w:top w:val="single" w:color="A6A6A6" w:sz="4"/>
-              <w:left w:val="single" w:color="A6A6A6" w:sz="4"/>
-              <w:bottom w:val="single" w:color="A6A6A6" w:sz="4"/>
-              <w:right w:val="single" w:color="A6A6A6" w:sz="4"/>
-            </w:tcBorders>
-            <w:tcMar>
-              <w:top w:type="dxa" w:w="45"/>
-              <w:left w:type="dxa" w:w="90"/>
-              <w:bottom w:type="dxa" w:w="45"/>
-              <w:right w:type="dxa" w:w="90"/>
-            </w:tcMar>
-            <w:vAlign w:val="center"/>
-          </w:tcPr>
-          <w:p>
-            <w:pPr>
-              <w:spacing w:after="0" w:line="250"/>
-              <w:jc w:val="center"/>
-            </w:pPr>
-            <w:r>
-              <w:rPr>
-                <w:rFonts w:ascii="Arial" w:cs="Arial" w:eastAsia="Arial" w:hAnsi="Arial"/>
-                <w:sz w:val="18"/>
-                <w:szCs w:val="18"/>
-              </w:rPr>
-              <w:t xml:space="preserve">0 × 15 = 0</w:t>
-            </w:r>
-          </w:p>
-        </w:tc>
-        <w:tc>
-          <w:tcPr>
-            <w:tcW w:type="dxa" w:w="1300"/>
-            <w:tcBorders>
-              <w:top w:val="single" w:color="A6A6A6" w:sz="4"/>
-              <w:left w:val="single" w:color="A6A6A6" w:sz="4"/>
-              <w:bottom w:val="single" w:color="A6A6A6" w:sz="4"/>
-              <w:right w:val="single" w:color="A6A6A6" w:sz="4"/>
-            </w:tcBorders>
-            <w:tcMar>
-              <w:top w:type="dxa" w:w="45"/>
-              <w:left w:type="dxa" w:w="90"/>
-              <w:bottom w:type="dxa" w:w="45"/>
-              <w:right w:type="dxa" w:w="90"/>
-            </w:tcMar>
-            <w:vAlign w:val="center"/>
-          </w:tcPr>
-          <w:p>
-            <w:pPr>
-              <w:spacing w:after="0" w:line="250"/>
-              <w:jc w:val="center"/>
-            </w:pPr>
-            <w:r>
-              <w:rPr>
-                <w:rFonts w:ascii="Arial" w:cs="Arial" w:eastAsia="Arial" w:hAnsi="Arial"/>
-                <w:sz w:val="18"/>
-                <w:szCs w:val="18"/>
-              </w:rPr>
-              <w:t xml:space="preserve">6</w:t>
-            </w:r>
-          </w:p>
-        </w:tc>
-        <w:tc>
-          <w:tcPr>
-            <w:tcW w:type="dxa" w:w="1238"/>
-            <w:tcBorders>
-              <w:top w:val="single" w:color="A6A6A6" w:sz="4"/>
-              <w:left w:val="single" w:color="A6A6A6" w:sz="4"/>
-              <w:bottom w:val="single" w:color="A6A6A6" w:sz="4"/>
-              <w:right w:val="single" w:color="A6A6A6" w:sz="4"/>
-            </w:tcBorders>
-            <w:tcMar>
-              <w:top w:type="dxa" w:w="45"/>
-              <w:left w:type="dxa" w:w="90"/>
-              <w:bottom w:type="dxa" w:w="45"/>
-              <w:right w:type="dxa" w:w="90"/>
-            </w:tcMar>
-            <w:vAlign w:val="center"/>
-          </w:tcPr>
-          <w:p>
-            <w:pPr>
-              <w:spacing w:after="0" w:line="250"/>
-              <w:jc w:val="center"/>
-            </w:pPr>
-            <w:r>
-              <w:rPr>
-                <w:rFonts w:ascii="Arial" w:cs="Arial" w:eastAsia="Arial" w:hAnsi="Arial"/>
-                <w:b/>
-                <w:bCs/>
-                <w:sz w:val="18"/>
-                <w:szCs w:val="18"/>
-              </w:rPr>
-              <w:t xml:space="preserve">42</w:t>
-            </w:r>
-          </w:p>
-        </w:tc>
-      </w:tr>
-      <w:tr>
-        <w:trPr>
-          <w:cantSplit/>
-        </w:trPr>
-        <w:tc>
-          <w:tcPr>
-            <w:tcW w:type="dxa" w:w="2600"/>
-            <w:tcBorders>
-              <w:top w:val="single" w:color="A6A6A6" w:sz="4"/>
-              <w:left w:val="single" w:color="A6A6A6" w:sz="4"/>
-              <w:bottom w:val="single" w:color="A6A6A6" w:sz="4"/>
-              <w:right w:val="single" w:color="A6A6A6" w:sz="4"/>
-            </w:tcBorders>
-            <w:tcMar>
-              <w:top w:type="dxa" w:w="45"/>
-              <w:left w:type="dxa" w:w="90"/>
-              <w:bottom w:type="dxa" w:w="45"/>
-              <w:right w:type="dxa" w:w="90"/>
-            </w:tcMar>
-            <w:vAlign w:val="center"/>
-          </w:tcPr>
-          <w:p>
-            <w:pPr>
-              <w:spacing w:after="0" w:line="250"/>
-            </w:pPr>
-            <w:r>
-              <w:rPr>
-                <w:rFonts w:ascii="Arial" w:cs="Arial" w:eastAsia="Arial" w:hAnsi="Arial"/>
-                <w:b/>
-                <w:bCs/>
-                <w:sz w:val="18"/>
-                <w:szCs w:val="18"/>
-              </w:rPr>
-              <w:t xml:space="preserve">AIE</w:t>
-            </w:r>
-          </w:p>
-        </w:tc>
-        <w:tc>
-          <w:tcPr>
-            <w:tcW w:type="dxa" w:w="1500"/>
-            <w:tcBorders>
-              <w:top w:val="single" w:color="A6A6A6" w:sz="4"/>
-              <w:left w:val="single" w:color="A6A6A6" w:sz="4"/>
-              <w:bottom w:val="single" w:color="A6A6A6" w:sz="4"/>
-              <w:right w:val="single" w:color="A6A6A6" w:sz="4"/>
-            </w:tcBorders>
-            <w:tcMar>
-              <w:top w:type="dxa" w:w="45"/>
-              <w:left w:type="dxa" w:w="90"/>
-              <w:bottom w:type="dxa" w:w="45"/>
-              <w:right w:type="dxa" w:w="90"/>
-            </w:tcMar>
-            <w:vAlign w:val="center"/>
-          </w:tcPr>
-          <w:p>
-            <w:pPr>
-              <w:spacing w:after="0" w:line="250"/>
-              <w:jc w:val="center"/>
-            </w:pPr>
-            <w:r>
-              <w:rPr>
-                <w:rFonts w:ascii="Arial" w:cs="Arial" w:eastAsia="Arial" w:hAnsi="Arial"/>
-                <w:sz w:val="18"/>
-                <w:szCs w:val="18"/>
-              </w:rPr>
-              <w:t xml:space="preserve">6 × 5 = 30</w:t>
-            </w:r>
-          </w:p>
-        </w:tc>
-        <w:tc>
-          <w:tcPr>
-            <w:tcW w:type="dxa" w:w="1500"/>
-            <w:tcBorders>
-              <w:top w:val="single" w:color="A6A6A6" w:sz="4"/>
-              <w:left w:val="single" w:color="A6A6A6" w:sz="4"/>
-              <w:bottom w:val="single" w:color="A6A6A6" w:sz="4"/>
-              <w:right w:val="single" w:color="A6A6A6" w:sz="4"/>
-            </w:tcBorders>
-            <w:tcMar>
-              <w:top w:type="dxa" w:w="45"/>
-              <w:left w:type="dxa" w:w="90"/>
-              <w:bottom w:type="dxa" w:w="45"/>
-              <w:right w:type="dxa" w:w="90"/>
-            </w:tcMar>
-            <w:vAlign w:val="center"/>
-          </w:tcPr>
-          <w:p>
-            <w:pPr>
-              <w:spacing w:after="0" w:line="250"/>
-              <w:jc w:val="center"/>
-            </w:pPr>
-            <w:r>
-              <w:rPr>
-                <w:rFonts w:ascii="Arial" w:cs="Arial" w:eastAsia="Arial" w:hAnsi="Arial"/>
-                <w:sz w:val="18"/>
-                <w:szCs w:val="18"/>
-              </w:rPr>
-              <w:t xml:space="preserve">0 × 7 = 0</w:t>
-            </w:r>
-          </w:p>
-        </w:tc>
-        <w:tc>
-          <w:tcPr>
-            <w:tcW w:type="dxa" w:w="1500"/>
-            <w:tcBorders>
-              <w:top w:val="single" w:color="A6A6A6" w:sz="4"/>
-              <w:left w:val="single" w:color="A6A6A6" w:sz="4"/>
-              <w:bottom w:val="single" w:color="A6A6A6" w:sz="4"/>
-              <w:right w:val="single" w:color="A6A6A6" w:sz="4"/>
-            </w:tcBorders>
-            <w:tcMar>
-              <w:top w:type="dxa" w:w="45"/>
-              <w:left w:type="dxa" w:w="90"/>
-              <w:bottom w:type="dxa" w:w="45"/>
-              <w:right w:type="dxa" w:w="90"/>
-            </w:tcMar>
-            <w:vAlign w:val="center"/>
-          </w:tcPr>
-          <w:p>
-            <w:pPr>
-              <w:spacing w:after="0" w:line="250"/>
-              <w:jc w:val="center"/>
-            </w:pPr>
-            <w:r>
-              <w:rPr>
-                <w:rFonts w:ascii="Arial" w:cs="Arial" w:eastAsia="Arial" w:hAnsi="Arial"/>
-                <w:sz w:val="18"/>
-                <w:szCs w:val="18"/>
-              </w:rPr>
-              <w:t xml:space="preserve">0 × 10 = 0</w:t>
-            </w:r>
-          </w:p>
-        </w:tc>
-        <w:tc>
-          <w:tcPr>
-            <w:tcW w:type="dxa" w:w="1300"/>
-            <w:tcBorders>
-              <w:top w:val="single" w:color="A6A6A6" w:sz="4"/>
-              <w:left w:val="single" w:color="A6A6A6" w:sz="4"/>
-              <w:bottom w:val="single" w:color="A6A6A6" w:sz="4"/>
-              <w:right w:val="single" w:color="A6A6A6" w:sz="4"/>
-            </w:tcBorders>
-            <w:tcMar>
-              <w:top w:type="dxa" w:w="45"/>
-              <w:left w:type="dxa" w:w="90"/>
-              <w:bottom w:type="dxa" w:w="45"/>
-              <w:right w:type="dxa" w:w="90"/>
-            </w:tcMar>
-            <w:vAlign w:val="center"/>
-          </w:tcPr>
-          <w:p>
-            <w:pPr>
-              <w:spacing w:after="0" w:line="250"/>
-              <w:jc w:val="center"/>
-            </w:pPr>
-            <w:r>
-              <w:rPr>
-                <w:rFonts w:ascii="Arial" w:cs="Arial" w:eastAsia="Arial" w:hAnsi="Arial"/>
-                <w:sz w:val="18"/>
-                <w:szCs w:val="18"/>
-              </w:rPr>
-              <w:t xml:space="preserve">6</w:t>
-            </w:r>
-          </w:p>
-        </w:tc>
-        <w:tc>
-          <w:tcPr>
-            <w:tcW w:type="dxa" w:w="1238"/>
-            <w:tcBorders>
-              <w:top w:val="single" w:color="A6A6A6" w:sz="4"/>
-              <w:left w:val="single" w:color="A6A6A6" w:sz="4"/>
-              <w:bottom w:val="single" w:color="A6A6A6" w:sz="4"/>
-              <w:right w:val="single" w:color="A6A6A6" w:sz="4"/>
-            </w:tcBorders>
-            <w:tcMar>
-              <w:top w:type="dxa" w:w="45"/>
-              <w:left w:type="dxa" w:w="90"/>
-              <w:bottom w:type="dxa" w:w="45"/>
-              <w:right w:type="dxa" w:w="90"/>
-            </w:tcMar>
-            <w:vAlign w:val="center"/>
-          </w:tcPr>
-          <w:p>
-            <w:pPr>
-              <w:spacing w:after="0" w:line="250"/>
-              <w:jc w:val="center"/>
-            </w:pPr>
-            <w:r>
-              <w:rPr>
-                <w:rFonts w:ascii="Arial" w:cs="Arial" w:eastAsia="Arial" w:hAnsi="Arial"/>
-                <w:b/>
-                <w:bCs/>
-                <w:sz w:val="18"/>
-                <w:szCs w:val="18"/>
-              </w:rPr>
-              <w:t xml:space="preserve">30</w:t>
-            </w:r>
-          </w:p>
-        </w:tc>
-      </w:tr>
-      <w:tr>
-        <w:trPr>
-          <w:cantSplit/>
-        </w:trPr>
-        <w:tc>
-          <w:tcPr>
-            <w:tcW w:type="dxa" w:w="2600"/>
-            <w:tcBorders>
-              <w:top w:val="single" w:color="A6A6A6" w:sz="4"/>
-              <w:left w:val="single" w:color="A6A6A6" w:sz="4"/>
-              <w:bottom w:val="single" w:color="A6A6A6" w:sz="4"/>
-              <w:right w:val="single" w:color="A6A6A6" w:sz="4"/>
-            </w:tcBorders>
-            <w:tcMar>
-              <w:top w:type="dxa" w:w="45"/>
-              <w:left w:type="dxa" w:w="90"/>
-              <w:bottom w:type="dxa" w:w="45"/>
-              <w:right w:type="dxa" w:w="90"/>
-            </w:tcMar>
-            <w:vAlign w:val="center"/>
-          </w:tcPr>
-          <w:p>
-            <w:pPr>
-              <w:spacing w:after="0" w:line="250"/>
-            </w:pPr>
-            <w:r>
-              <w:rPr>
-                <w:rFonts w:ascii="Arial" w:cs="Arial" w:eastAsia="Arial" w:hAnsi="Arial"/>
-                <w:b/>
-                <w:bCs/>
-                <w:sz w:val="18"/>
-                <w:szCs w:val="18"/>
-              </w:rPr>
-              <w:t xml:space="preserve">EE</w:t>
-            </w:r>
-          </w:p>
-        </w:tc>
-        <w:tc>
-          <w:tcPr>
-            <w:tcW w:type="dxa" w:w="1500"/>
-            <w:tcBorders>
-              <w:top w:val="single" w:color="A6A6A6" w:sz="4"/>
-              <w:left w:val="single" w:color="A6A6A6" w:sz="4"/>
-              <w:bottom w:val="single" w:color="A6A6A6" w:sz="4"/>
-              <w:right w:val="single" w:color="A6A6A6" w:sz="4"/>
-            </w:tcBorders>
-            <w:tcMar>
-              <w:top w:type="dxa" w:w="45"/>
-              <w:left w:type="dxa" w:w="90"/>
-              <w:bottom w:type="dxa" w:w="45"/>
-              <w:right w:type="dxa" w:w="90"/>
-            </w:tcMar>
-            <w:vAlign w:val="center"/>
-          </w:tcPr>
-          <w:p>
-            <w:pPr>
-              <w:spacing w:after="0" w:line="250"/>
-              <w:jc w:val="center"/>
-            </w:pPr>
-            <w:r>
-              <w:rPr>
-                <w:rFonts w:ascii="Arial" w:cs="Arial" w:eastAsia="Arial" w:hAnsi="Arial"/>
-                <w:sz w:val="18"/>
-                <w:szCs w:val="18"/>
-              </w:rPr>
-              <w:t xml:space="preserve">4 × 3 = 12</w:t>
-            </w:r>
-          </w:p>
-        </w:tc>
-        <w:tc>
-          <w:tcPr>
-            <w:tcW w:type="dxa" w:w="1500"/>
-            <w:tcBorders>
-              <w:top w:val="single" w:color="A6A6A6" w:sz="4"/>
-              <w:left w:val="single" w:color="A6A6A6" w:sz="4"/>
-              <w:bottom w:val="single" w:color="A6A6A6" w:sz="4"/>
-              <w:right w:val="single" w:color="A6A6A6" w:sz="4"/>
-            </w:tcBorders>
-            <w:tcMar>
-              <w:top w:type="dxa" w:w="45"/>
-              <w:left w:type="dxa" w:w="90"/>
-              <w:bottom w:type="dxa" w:w="45"/>
-              <w:right w:type="dxa" w:w="90"/>
-            </w:tcMar>
-            <w:vAlign w:val="center"/>
-          </w:tcPr>
-          <w:p>
-            <w:pPr>
-              <w:spacing w:after="0" w:line="250"/>
-              <w:jc w:val="center"/>
-            </w:pPr>
-            <w:r>
-              <w:rPr>
-                <w:rFonts w:ascii="Arial" w:cs="Arial" w:eastAsia="Arial" w:hAnsi="Arial"/>
-                <w:sz w:val="18"/>
-                <w:szCs w:val="18"/>
-              </w:rPr>
-              <w:t xml:space="preserve">7 × 4 = 28</w:t>
-            </w:r>
-          </w:p>
-        </w:tc>
-        <w:tc>
-          <w:tcPr>
-            <w:tcW w:type="dxa" w:w="1500"/>
-            <w:tcBorders>
-              <w:top w:val="single" w:color="A6A6A6" w:sz="4"/>
-              <w:left w:val="single" w:color="A6A6A6" w:sz="4"/>
-              <w:bottom w:val="single" w:color="A6A6A6" w:sz="4"/>
-              <w:right w:val="single" w:color="A6A6A6" w:sz="4"/>
-            </w:tcBorders>
-            <w:tcMar>
-              <w:top w:type="dxa" w:w="45"/>
-              <w:left w:type="dxa" w:w="90"/>
-              <w:bottom w:type="dxa" w:w="45"/>
-              <w:right w:type="dxa" w:w="90"/>
-            </w:tcMar>
-            <w:vAlign w:val="center"/>
-          </w:tcPr>
-          <w:p>
-            <w:pPr>
-              <w:spacing w:after="0" w:line="250"/>
-              <w:jc w:val="center"/>
-            </w:pPr>
-            <w:r>
-              <w:rPr>
-                <w:rFonts w:ascii="Arial" w:cs="Arial" w:eastAsia="Arial" w:hAnsi="Arial"/>
-                <w:sz w:val="18"/>
-                <w:szCs w:val="18"/>
-              </w:rPr>
-              <w:t xml:space="preserve">1 × 6 = 6</w:t>
-            </w:r>
-          </w:p>
-        </w:tc>
-        <w:tc>
-          <w:tcPr>
-            <w:tcW w:type="dxa" w:w="1300"/>
-            <w:tcBorders>
-              <w:top w:val="single" w:color="A6A6A6" w:sz="4"/>
-              <w:left w:val="single" w:color="A6A6A6" w:sz="4"/>
-              <w:bottom w:val="single" w:color="A6A6A6" w:sz="4"/>
-              <w:right w:val="single" w:color="A6A6A6" w:sz="4"/>
-            </w:tcBorders>
-            <w:tcMar>
-              <w:top w:type="dxa" w:w="45"/>
-              <w:left w:type="dxa" w:w="90"/>
-              <w:bottom w:type="dxa" w:w="45"/>
-              <w:right w:type="dxa" w:w="90"/>
-            </w:tcMar>
-            <w:vAlign w:val="center"/>
-          </w:tcPr>
-          <w:p>
-            <w:pPr>
-              <w:spacing w:after="0" w:line="250"/>
-              <w:jc w:val="center"/>
-            </w:pPr>
-            <w:r>
-              <w:rPr>
-                <w:rFonts w:ascii="Arial" w:cs="Arial" w:eastAsia="Arial" w:hAnsi="Arial"/>
-                <w:sz w:val="18"/>
-                <w:szCs w:val="18"/>
-              </w:rPr>
-              <w:t xml:space="preserve">12</w:t>
-            </w:r>
-          </w:p>
-        </w:tc>
-        <w:tc>
-          <w:tcPr>
-            <w:tcW w:type="dxa" w:w="1238"/>
-            <w:tcBorders>
-              <w:top w:val="single" w:color="A6A6A6" w:sz="4"/>
-              <w:left w:val="single" w:color="A6A6A6" w:sz="4"/>
-              <w:bottom w:val="single" w:color="A6A6A6" w:sz="4"/>
-              <w:right w:val="single" w:color="A6A6A6" w:sz="4"/>
-            </w:tcBorders>
-            <w:tcMar>
-              <w:top w:type="dxa" w:w="45"/>
-              <w:left w:type="dxa" w:w="90"/>
-              <w:bottom w:type="dxa" w:w="45"/>
-              <w:right w:type="dxa" w:w="90"/>
-            </w:tcMar>
-            <w:vAlign w:val="center"/>
-          </w:tcPr>
-          <w:p>
-            <w:pPr>
-              <w:spacing w:after="0" w:line="250"/>
-              <w:jc w:val="center"/>
-            </w:pPr>
-            <w:r>
-              <w:rPr>
-                <w:rFonts w:ascii="Arial" w:cs="Arial" w:eastAsia="Arial" w:hAnsi="Arial"/>
-                <w:b/>
-                <w:bCs/>
-                <w:sz w:val="18"/>
-                <w:szCs w:val="18"/>
-              </w:rPr>
-              <w:t xml:space="preserve">46</w:t>
-            </w:r>
-          </w:p>
-        </w:tc>
-      </w:tr>
-      <w:tr>
-        <w:trPr>
-          <w:cantSplit/>
-        </w:trPr>
-        <w:tc>
-          <w:tcPr>
-            <w:tcW w:type="dxa" w:w="2600"/>
-            <w:tcBorders>
-              <w:top w:val="single" w:color="A6A6A6" w:sz="4"/>
-              <w:left w:val="single" w:color="A6A6A6" w:sz="4"/>
-              <w:bottom w:val="single" w:color="A6A6A6" w:sz="4"/>
-              <w:right w:val="single" w:color="A6A6A6" w:sz="4"/>
-            </w:tcBorders>
-            <w:tcMar>
-              <w:top w:type="dxa" w:w="45"/>
-              <w:left w:type="dxa" w:w="90"/>
-              <w:bottom w:type="dxa" w:w="45"/>
-              <w:right w:type="dxa" w:w="90"/>
-            </w:tcMar>
-            <w:vAlign w:val="center"/>
-          </w:tcPr>
-          <w:p>
-            <w:pPr>
-              <w:spacing w:after="0" w:line="250"/>
-            </w:pPr>
-            <w:r>
-              <w:rPr>
-                <w:rFonts w:ascii="Arial" w:cs="Arial" w:eastAsia="Arial" w:hAnsi="Arial"/>
-                <w:b/>
-                <w:bCs/>
-                <w:sz w:val="18"/>
-                <w:szCs w:val="18"/>
-              </w:rPr>
-              <w:t xml:space="preserve">SE</w:t>
-            </w:r>
-          </w:p>
-        </w:tc>
-        <w:tc>
-          <w:tcPr>
-            <w:tcW w:type="dxa" w:w="1500"/>
-            <w:tcBorders>
-              <w:top w:val="single" w:color="A6A6A6" w:sz="4"/>
-              <w:left w:val="single" w:color="A6A6A6" w:sz="4"/>
-              <w:bottom w:val="single" w:color="A6A6A6" w:sz="4"/>
-              <w:right w:val="single" w:color="A6A6A6" w:sz="4"/>
-            </w:tcBorders>
-            <w:tcMar>
-              <w:top w:type="dxa" w:w="45"/>
-              <w:left w:type="dxa" w:w="90"/>
-              <w:bottom w:type="dxa" w:w="45"/>
-              <w:right w:type="dxa" w:w="90"/>
-            </w:tcMar>
-            <w:vAlign w:val="center"/>
-          </w:tcPr>
-          <w:p>
-            <w:pPr>
-              <w:spacing w:after="0" w:line="250"/>
-              <w:jc w:val="center"/>
-            </w:pPr>
-            <w:r>
-              <w:rPr>
-                <w:rFonts w:ascii="Arial" w:cs="Arial" w:eastAsia="Arial" w:hAnsi="Arial"/>
-                <w:sz w:val="18"/>
-                <w:szCs w:val="18"/>
-              </w:rPr>
-              <w:t xml:space="preserve">0 × 4 = 0</w:t>
-            </w:r>
-          </w:p>
-        </w:tc>
-        <w:tc>
-          <w:tcPr>
-            <w:tcW w:type="dxa" w:w="1500"/>
-            <w:tcBorders>
-              <w:top w:val="single" w:color="A6A6A6" w:sz="4"/>
-              <w:left w:val="single" w:color="A6A6A6" w:sz="4"/>
-              <w:bottom w:val="single" w:color="A6A6A6" w:sz="4"/>
-              <w:right w:val="single" w:color="A6A6A6" w:sz="4"/>
-            </w:tcBorders>
-            <w:tcMar>
-              <w:top w:type="dxa" w:w="45"/>
-              <w:left w:type="dxa" w:w="90"/>
-              <w:bottom w:type="dxa" w:w="45"/>
-              <w:right w:type="dxa" w:w="90"/>
-            </w:tcMar>
-            <w:vAlign w:val="center"/>
-          </w:tcPr>
-          <w:p>
-            <w:pPr>
-              <w:spacing w:after="0" w:line="250"/>
-              <w:jc w:val="center"/>
-            </w:pPr>
-            <w:r>
-              <w:rPr>
-                <w:rFonts w:ascii="Arial" w:cs="Arial" w:eastAsia="Arial" w:hAnsi="Arial"/>
-                <w:sz w:val="18"/>
-                <w:szCs w:val="18"/>
-              </w:rPr>
-              <w:t xml:space="preserve">4 × 5 = 20</w:t>
-            </w:r>
-          </w:p>
-        </w:tc>
-        <w:tc>
-          <w:tcPr>
-            <w:tcW w:type="dxa" w:w="1500"/>
-            <w:tcBorders>
-              <w:top w:val="single" w:color="A6A6A6" w:sz="4"/>
-              <w:left w:val="single" w:color="A6A6A6" w:sz="4"/>
-              <w:bottom w:val="single" w:color="A6A6A6" w:sz="4"/>
-              <w:right w:val="single" w:color="A6A6A6" w:sz="4"/>
-            </w:tcBorders>
-            <w:tcMar>
-              <w:top w:type="dxa" w:w="45"/>
-              <w:left w:type="dxa" w:w="90"/>
-              <w:bottom w:type="dxa" w:w="45"/>
-              <w:right w:type="dxa" w:w="90"/>
-            </w:tcMar>
-            <w:vAlign w:val="center"/>
-          </w:tcPr>
-          <w:p>
-            <w:pPr>
-              <w:spacing w:after="0" w:line="250"/>
-              <w:jc w:val="center"/>
-            </w:pPr>
-            <w:r>
-              <w:rPr>
-                <w:rFonts w:ascii="Arial" w:cs="Arial" w:eastAsia="Arial" w:hAnsi="Arial"/>
-                <w:sz w:val="18"/>
-                <w:szCs w:val="18"/>
-              </w:rPr>
-              <w:t xml:space="preserve">2 × 7 = 14</w:t>
-            </w:r>
-          </w:p>
-        </w:tc>
-        <w:tc>
-          <w:tcPr>
-            <w:tcW w:type="dxa" w:w="1300"/>
-            <w:tcBorders>
-              <w:top w:val="single" w:color="A6A6A6" w:sz="4"/>
-              <w:left w:val="single" w:color="A6A6A6" w:sz="4"/>
-              <w:bottom w:val="single" w:color="A6A6A6" w:sz="4"/>
-              <w:right w:val="single" w:color="A6A6A6" w:sz="4"/>
-            </w:tcBorders>
-            <w:tcMar>
-              <w:top w:type="dxa" w:w="45"/>
-              <w:left w:type="dxa" w:w="90"/>
-              <w:bottom w:type="dxa" w:w="45"/>
-              <w:right w:type="dxa" w:w="90"/>
-            </w:tcMar>
-            <w:vAlign w:val="center"/>
-          </w:tcPr>
-          <w:p>
-            <w:pPr>
-              <w:spacing w:after="0" w:line="250"/>
-              <w:jc w:val="center"/>
-            </w:pPr>
-            <w:r>
-              <w:rPr>
-                <w:rFonts w:ascii="Arial" w:cs="Arial" w:eastAsia="Arial" w:hAnsi="Arial"/>
-                <w:sz w:val="18"/>
-                <w:szCs w:val="18"/>
-              </w:rPr>
-              <w:t xml:space="preserve">6</w:t>
-            </w:r>
-          </w:p>
-        </w:tc>
-        <w:tc>
-          <w:tcPr>
-            <w:tcW w:type="dxa" w:w="1238"/>
-            <w:tcBorders>
-              <w:top w:val="single" w:color="A6A6A6" w:sz="4"/>
-              <w:left w:val="single" w:color="A6A6A6" w:sz="4"/>
-              <w:bottom w:val="single" w:color="A6A6A6" w:sz="4"/>
-              <w:right w:val="single" w:color="A6A6A6" w:sz="4"/>
-            </w:tcBorders>
-            <w:tcMar>
-              <w:top w:type="dxa" w:w="45"/>
-              <w:left w:type="dxa" w:w="90"/>
-              <w:bottom w:type="dxa" w:w="45"/>
-              <w:right w:type="dxa" w:w="90"/>
-            </w:tcMar>
-            <w:vAlign w:val="center"/>
-          </w:tcPr>
-          <w:p>
-            <w:pPr>
-              <w:spacing w:after="0" w:line="250"/>
-              <w:jc w:val="center"/>
-            </w:pPr>
-            <w:r>
-              <w:rPr>
-                <w:rFonts w:ascii="Arial" w:cs="Arial" w:eastAsia="Arial" w:hAnsi="Arial"/>
-                <w:b/>
-                <w:bCs/>
-                <w:sz w:val="18"/>
-                <w:szCs w:val="18"/>
-              </w:rPr>
-              <w:t xml:space="preserve">34</w:t>
-            </w:r>
-          </w:p>
-        </w:tc>
-      </w:tr>
-      <w:tr>
-        <w:trPr>
-          <w:cantSplit/>
-        </w:trPr>
-        <w:tc>
-          <w:tcPr>
-            <w:tcW w:type="dxa" w:w="2600"/>
-            <w:tcBorders>
-              <w:top w:val="single" w:color="A6A6A6" w:sz="4"/>
-              <w:left w:val="single" w:color="A6A6A6" w:sz="4"/>
-              <w:bottom w:val="single" w:color="A6A6A6" w:sz="4"/>
-              <w:right w:val="single" w:color="A6A6A6" w:sz="4"/>
-            </w:tcBorders>
-            <w:tcMar>
-              <w:top w:type="dxa" w:w="45"/>
-              <w:left w:type="dxa" w:w="90"/>
-              <w:bottom w:type="dxa" w:w="45"/>
-              <w:right w:type="dxa" w:w="90"/>
-            </w:tcMar>
-            <w:vAlign w:val="center"/>
-          </w:tcPr>
-          <w:p>
-            <w:pPr>
-              <w:spacing w:after="0" w:line="250"/>
-            </w:pPr>
-            <w:r>
-              <w:rPr>
-                <w:rFonts w:ascii="Arial" w:cs="Arial" w:eastAsia="Arial" w:hAnsi="Arial"/>
-                <w:b/>
-                <w:bCs/>
-                <w:sz w:val="18"/>
-                <w:szCs w:val="18"/>
-              </w:rPr>
-              <w:t xml:space="preserve">CE</w:t>
-            </w:r>
-          </w:p>
-        </w:tc>
-        <w:tc>
-          <w:tcPr>
-            <w:tcW w:type="dxa" w:w="1500"/>
-            <w:tcBorders>
-              <w:top w:val="single" w:color="A6A6A6" w:sz="4"/>
-              <w:left w:val="single" w:color="A6A6A6" w:sz="4"/>
-              <w:bottom w:val="single" w:color="A6A6A6" w:sz="4"/>
-              <w:right w:val="single" w:color="A6A6A6" w:sz="4"/>
-            </w:tcBorders>
-            <w:tcMar>
-              <w:top w:type="dxa" w:w="45"/>
-              <w:left w:type="dxa" w:w="90"/>
-              <w:bottom w:type="dxa" w:w="45"/>
-              <w:right w:type="dxa" w:w="90"/>
-            </w:tcMar>
-            <w:vAlign w:val="center"/>
-          </w:tcPr>
-          <w:p>
-            <w:pPr>
-              <w:spacing w:after="0" w:line="250"/>
-              <w:jc w:val="center"/>
-            </w:pPr>
-            <w:r>
-              <w:rPr>
-                <w:rFonts w:ascii="Arial" w:cs="Arial" w:eastAsia="Arial" w:hAnsi="Arial"/>
-                <w:sz w:val="18"/>
-                <w:szCs w:val="18"/>
-              </w:rPr>
-              <w:t xml:space="preserve">3 × 3 = 9</w:t>
-            </w:r>
-          </w:p>
-        </w:tc>
-        <w:tc>
-          <w:tcPr>
-            <w:tcW w:type="dxa" w:w="1500"/>
-            <w:tcBorders>
-              <w:top w:val="single" w:color="A6A6A6" w:sz="4"/>
-              <w:left w:val="single" w:color="A6A6A6" w:sz="4"/>
-              <w:bottom w:val="single" w:color="A6A6A6" w:sz="4"/>
-              <w:right w:val="single" w:color="A6A6A6" w:sz="4"/>
-            </w:tcBorders>
-            <w:tcMar>
-              <w:top w:type="dxa" w:w="45"/>
-              <w:left w:type="dxa" w:w="90"/>
-              <w:bottom w:type="dxa" w:w="45"/>
-              <w:right w:type="dxa" w:w="90"/>
-            </w:tcMar>
-            <w:vAlign w:val="center"/>
-          </w:tcPr>
-          <w:p>
-            <w:pPr>
-              <w:spacing w:after="0" w:line="250"/>
-              <w:jc w:val="center"/>
-            </w:pPr>
-            <w:r>
-              <w:rPr>
-                <w:rFonts w:ascii="Arial" w:cs="Arial" w:eastAsia="Arial" w:hAnsi="Arial"/>
-                <w:sz w:val="18"/>
-                <w:szCs w:val="18"/>
-              </w:rPr>
-              <w:t xml:space="preserve">3 × 4 = 12</w:t>
-            </w:r>
-          </w:p>
-        </w:tc>
-        <w:tc>
-          <w:tcPr>
-            <w:tcW w:type="dxa" w:w="1500"/>
-            <w:tcBorders>
-              <w:top w:val="single" w:color="A6A6A6" w:sz="4"/>
-              <w:left w:val="single" w:color="A6A6A6" w:sz="4"/>
-              <w:bottom w:val="single" w:color="A6A6A6" w:sz="4"/>
-              <w:right w:val="single" w:color="A6A6A6" w:sz="4"/>
-            </w:tcBorders>
-            <w:tcMar>
-              <w:top w:type="dxa" w:w="45"/>
-              <w:left w:type="dxa" w:w="90"/>
-              <w:bottom w:type="dxa" w:w="45"/>
-              <w:right w:type="dxa" w:w="90"/>
-            </w:tcMar>
-            <w:vAlign w:val="center"/>
-          </w:tcPr>
-          <w:p>
-            <w:pPr>
-              <w:spacing w:after="0" w:line="250"/>
-              <w:jc w:val="center"/>
-            </w:pPr>
-            <w:r>
-              <w:rPr>
-                <w:rFonts w:ascii="Arial" w:cs="Arial" w:eastAsia="Arial" w:hAnsi="Arial"/>
-                <w:sz w:val="18"/>
-                <w:szCs w:val="18"/>
-              </w:rPr>
-              <w:t xml:space="preserve">0 × 6 = 0</w:t>
-            </w:r>
-          </w:p>
-        </w:tc>
-        <w:tc>
-          <w:tcPr>
-            <w:tcW w:type="dxa" w:w="1300"/>
-            <w:tcBorders>
-              <w:top w:val="single" w:color="A6A6A6" w:sz="4"/>
-              <w:left w:val="single" w:color="A6A6A6" w:sz="4"/>
-              <w:bottom w:val="single" w:color="A6A6A6" w:sz="4"/>
-              <w:right w:val="single" w:color="A6A6A6" w:sz="4"/>
-            </w:tcBorders>
-            <w:tcMar>
-              <w:top w:type="dxa" w:w="45"/>
-              <w:left w:type="dxa" w:w="90"/>
-              <w:bottom w:type="dxa" w:w="45"/>
-              <w:right w:type="dxa" w:w="90"/>
-            </w:tcMar>
-            <w:vAlign w:val="center"/>
-          </w:tcPr>
-          <w:p>
-            <w:pPr>
-              <w:spacing w:after="0" w:line="250"/>
-              <w:jc w:val="center"/>
-            </w:pPr>
-            <w:r>
-              <w:rPr>
-                <w:rFonts w:ascii="Arial" w:cs="Arial" w:eastAsia="Arial" w:hAnsi="Arial"/>
-                <w:sz w:val="18"/>
-                <w:szCs w:val="18"/>
-              </w:rPr>
-              <w:t xml:space="preserve">6</w:t>
-            </w:r>
-          </w:p>
-        </w:tc>
-        <w:tc>
-          <w:tcPr>
-            <w:tcW w:type="dxa" w:w="1238"/>
-            <w:tcBorders>
-              <w:top w:val="single" w:color="A6A6A6" w:sz="4"/>
-              <w:left w:val="single" w:color="A6A6A6" w:sz="4"/>
-              <w:bottom w:val="single" w:color="A6A6A6" w:sz="4"/>
-              <w:right w:val="single" w:color="A6A6A6" w:sz="4"/>
-            </w:tcBorders>
-            <w:tcMar>
-              <w:top w:type="dxa" w:w="45"/>
-              <w:left w:type="dxa" w:w="90"/>
-              <w:bottom w:type="dxa" w:w="45"/>
-              <w:right w:type="dxa" w:w="90"/>
-            </w:tcMar>
-            <w:vAlign w:val="center"/>
-          </w:tcPr>
-          <w:p>
-            <w:pPr>
-              <w:spacing w:after="0" w:line="250"/>
-              <w:jc w:val="center"/>
-            </w:pPr>
-            <w:r>
-              <w:rPr>
-                <w:rFonts w:ascii="Arial" w:cs="Arial" w:eastAsia="Arial" w:hAnsi="Arial"/>
-                <w:b/>
-                <w:bCs/>
-                <w:sz w:val="18"/>
-                <w:szCs w:val="18"/>
-              </w:rPr>
-              <w:t xml:space="preserve">21</w:t>
-            </w:r>
-          </w:p>
-        </w:tc>
-      </w:tr>
-      <w:tr>
-        <w:tc>
-          <w:tcPr>
-            <w:tcW w:type="dxa" w:w="7100"/>
-            <w:gridSpan w:val="4"/>
-            <w:tcBorders>
-              <w:top w:val="single" w:color="A6A6A6" w:sz="4"/>
-              <w:left w:val="single" w:color="A6A6A6" w:sz="4"/>
-              <w:bottom w:val="single" w:color="A6A6A6" w:sz="4"/>
-              <w:right w:val="single" w:color="A6A6A6" w:sz="4"/>
-            </w:tcBorders>
-            <w:shd w:fill="E7E6E6" w:color="auto" w:val="clear"/>
-            <w:tcMar>
-              <w:top w:type="dxa" w:w="45"/>
-              <w:left w:type="dxa" w:w="90"/>
-              <w:bottom w:type="dxa" w:w="45"/>
-              <w:right w:type="dxa" w:w="90"/>
-            </w:tcMar>
-            <w:vAlign w:val="center"/>
-          </w:tcPr>
-          <w:p>
-            <w:pPr>
-              <w:spacing w:after="0" w:line="250"/>
-            </w:pPr>
-            <w:r>
-              <w:rPr>
-                <w:rFonts w:ascii="Arial" w:cs="Arial" w:eastAsia="Arial" w:hAnsi="Arial"/>
-                <w:b/>
-                <w:bCs/>
-                <w:sz w:val="18"/>
-                <w:szCs w:val="18"/>
-              </w:rPr>
-              <w:t xml:space="preserve">PFB</w:t>
-            </w:r>
-          </w:p>
-        </w:tc>
-        <w:tc>
-          <w:tcPr>
-            <w:tcW w:type="dxa" w:w="1300"/>
-            <w:tcBorders>
-              <w:top w:val="single" w:color="A6A6A6" w:sz="4"/>
-              <w:left w:val="single" w:color="A6A6A6" w:sz="4"/>
-              <w:bottom w:val="single" w:color="A6A6A6" w:sz="4"/>
-              <w:right w:val="single" w:color="A6A6A6" w:sz="4"/>
-            </w:tcBorders>
-            <w:shd w:fill="E7E6E6" w:color="auto" w:val="clear"/>
-            <w:tcMar>
-              <w:top w:type="dxa" w:w="45"/>
-              <w:left w:type="dxa" w:w="90"/>
-              <w:bottom w:type="dxa" w:w="45"/>
-              <w:right w:type="dxa" w:w="90"/>
-            </w:tcMar>
-            <w:vAlign w:val="center"/>
-          </w:tcPr>
-          <w:p>
-            <w:pPr>
-              <w:spacing w:after="0" w:line="250"/>
-              <w:jc w:val="center"/>
-            </w:pPr>
-            <w:r>
-              <w:rPr>
-                <w:rFonts w:ascii="Arial" w:cs="Arial" w:eastAsia="Arial" w:hAnsi="Arial"/>
-                <w:b/>
-                <w:bCs/>
-                <w:sz w:val="18"/>
-                <w:szCs w:val="18"/>
-              </w:rPr>
-              <w:t xml:space="preserve">36</w:t>
-            </w:r>
-          </w:p>
-        </w:tc>
-        <w:tc>
-          <w:tcPr>
-            <w:tcW w:type="dxa" w:w="1238"/>
-            <w:tcBorders>
-              <w:top w:val="single" w:color="A6A6A6" w:sz="4"/>
-              <w:left w:val="single" w:color="A6A6A6" w:sz="4"/>
-              <w:bottom w:val="single" w:color="A6A6A6" w:sz="4"/>
-              <w:right w:val="single" w:color="A6A6A6" w:sz="4"/>
-            </w:tcBorders>
-            <w:shd w:fill="E7E6E6" w:color="auto" w:val="clear"/>
-            <w:tcMar>
-              <w:top w:type="dxa" w:w="45"/>
-              <w:left w:type="dxa" w:w="90"/>
-              <w:bottom w:type="dxa" w:w="45"/>
-              <w:right w:type="dxa" w:w="90"/>
-            </w:tcMar>
-            <w:vAlign w:val="center"/>
-          </w:tcPr>
-          <w:p>
-            <w:pPr>
-              <w:spacing w:after="0" w:line="250"/>
-              <w:jc w:val="center"/>
-            </w:pPr>
-            <w:r>
-              <w:rPr>
-                <w:rFonts w:ascii="Arial" w:cs="Arial" w:eastAsia="Arial" w:hAnsi="Arial"/>
-                <w:b/>
-                <w:bCs/>
-                <w:sz w:val="18"/>
-                <w:szCs w:val="18"/>
-              </w:rPr>
-              <w:t xml:space="preserve">173</w:t>
-            </w:r>
-          </w:p>
-        </w:tc>
-      </w:tr>
-    </w:tbl>
-    <w:p>
-      <w:pPr>
-        <w:spacing w:after="60" w:before="0" w:line="276"/>
-      </w:pPr>
-      <w:r>
-        <w:rPr>
-          <w:rFonts w:ascii="Arial" w:cs="Arial" w:eastAsia="Arial" w:hAnsi="Arial"/>
-          <w:sz w:val="21"/>
-          <w:szCs w:val="21"/>
-        </w:rPr>
-        <w:t xml:space="preserve"/>
-      </w:r>
-    </w:p>
-    <w:p>
-      <w:pPr>
-        <w:pStyle w:val="Heading2"/>
-        <w:keepNext/>
-        <w:spacing w:after="80" w:before="200"/>
-      </w:pPr>
-      <w:r>
-        <w:rPr>
-          <w:rFonts w:ascii="Arial" w:cs="Arial" w:eastAsia="Arial" w:hAnsi="Arial"/>
-          <w:b/>
-          <w:bCs/>
-          <w:color w:val="2F5496"/>
-          <w:sz w:val="24"/>
-          <w:szCs w:val="24"/>
-        </w:rPr>
-        <w:t xml:space="preserve">PFB por integrante</w:t>
-      </w:r>
-    </w:p>
-    <w:tbl>
-      <w:tblPr>
-        <w:tblW w:type="dxa" w:w="9638"/>
-        <w:tblBorders>
-          <w:top w:val="single" w:color="auto" w:sz="4"/>
-          <w:left w:val="single" w:color="auto" w:sz="4"/>
-          <w:bottom w:val="single" w:color="auto" w:sz="4"/>
-          <w:right w:val="single" w:color="auto" w:sz="4"/>
-          <w:insideH w:val="single" w:color="auto" w:sz="4"/>
-          <w:insideV w:val="single" w:color="auto" w:sz="4"/>
-        </w:tblBorders>
-      </w:tblPr>
-      <w:tblGrid>
-        <w:gridCol w:w="3000"/>
-        <w:gridCol w:w="1600"/>
-        <w:gridCol w:w="1600"/>
-        <w:gridCol w:w="1600"/>
-        <w:gridCol w:w="1838"/>
-      </w:tblGrid>
-      <w:tr>
-        <w:trPr>
-          <w:cantSplit/>
-          <w:tblHeader/>
-        </w:trPr>
-        <w:tc>
-          <w:tcPr>
-            <w:tcW w:type="dxa" w:w="3000"/>
-            <w:tcBorders>
-              <w:top w:val="single" w:color="A6A6A6" w:sz="4"/>
-              <w:left w:val="single" w:color="A6A6A6" w:sz="4"/>
-              <w:bottom w:val="single" w:color="A6A6A6" w:sz="4"/>
-              <w:right w:val="single" w:color="A6A6A6" w:sz="4"/>
-            </w:tcBorders>
-            <w:shd w:fill="E7E6E6" w:color="auto" w:val="clear"/>
-            <w:tcMar>
-              <w:top w:type="dxa" w:w="45"/>
-              <w:left w:type="dxa" w:w="90"/>
-              <w:bottom w:type="dxa" w:w="45"/>
-              <w:right w:type="dxa" w:w="90"/>
-            </w:tcMar>
-            <w:vAlign w:val="center"/>
-          </w:tcPr>
-          <w:p>
-            <w:pPr>
-              <w:keepNext/>
-              <w:spacing w:after="0" w:line="250"/>
-              <w:jc w:val="left"/>
-            </w:pPr>
-            <w:r>
-              <w:rPr>
-                <w:rFonts w:ascii="Arial" w:cs="Arial" w:eastAsia="Arial" w:hAnsi="Arial"/>
-                <w:b/>
-                <w:bCs/>
-                <w:sz w:val="18"/>
-                <w:szCs w:val="18"/>
-              </w:rPr>
-              <w:t xml:space="preserve">Integrante</w:t>
-            </w:r>
-          </w:p>
-        </w:tc>
-        <w:tc>
-          <w:tcPr>
-            <w:tcW w:type="dxa" w:w="1600"/>
-            <w:tcBorders>
-              <w:top w:val="single" w:color="A6A6A6" w:sz="4"/>
-              <w:left w:val="single" w:color="A6A6A6" w:sz="4"/>
-              <w:bottom w:val="single" w:color="A6A6A6" w:sz="4"/>
-              <w:right w:val="single" w:color="A6A6A6" w:sz="4"/>
-            </w:tcBorders>
-            <w:shd w:fill="E7E6E6" w:color="auto" w:val="clear"/>
-            <w:tcMar>
-              <w:top w:type="dxa" w:w="45"/>
-              <w:left w:type="dxa" w:w="90"/>
-              <w:bottom w:type="dxa" w:w="45"/>
-              <w:right w:type="dxa" w:w="90"/>
-            </w:tcMar>
-            <w:vAlign w:val="center"/>
-          </w:tcPr>
-          <w:p>
-            <w:pPr>
-              <w:keepNext/>
-              <w:spacing w:after="0" w:line="250"/>
-              <w:jc w:val="center"/>
-            </w:pPr>
-            <w:r>
-              <w:rPr>
-                <w:rFonts w:ascii="Arial" w:cs="Arial" w:eastAsia="Arial" w:hAnsi="Arial"/>
-                <w:b/>
-                <w:bCs/>
-                <w:sz w:val="18"/>
-                <w:szCs w:val="18"/>
-              </w:rPr>
-              <w:t xml:space="preserve">PFB</w:t>
-            </w:r>
-          </w:p>
-        </w:tc>
-        <w:tc>
-          <w:tcPr>
-            <w:tcW w:type="dxa" w:w="1600"/>
-            <w:tcBorders>
-              <w:top w:val="single" w:color="A6A6A6" w:sz="4"/>
-              <w:left w:val="single" w:color="A6A6A6" w:sz="4"/>
-              <w:bottom w:val="single" w:color="A6A6A6" w:sz="4"/>
-              <w:right w:val="single" w:color="A6A6A6" w:sz="4"/>
-            </w:tcBorders>
-            <w:shd w:fill="E7E6E6" w:color="auto" w:val="clear"/>
-            <w:tcMar>
-              <w:top w:type="dxa" w:w="45"/>
-              <w:left w:type="dxa" w:w="90"/>
-              <w:bottom w:type="dxa" w:w="45"/>
-              <w:right w:type="dxa" w:w="90"/>
-            </w:tcMar>
-            <w:vAlign w:val="center"/>
-          </w:tcPr>
-          <w:p>
-            <w:pPr>
-              <w:keepNext/>
-              <w:spacing w:after="0" w:line="250"/>
-              <w:jc w:val="center"/>
-            </w:pPr>
-            <w:r>
-              <w:rPr>
-                <w:rFonts w:ascii="Arial" w:cs="Arial" w:eastAsia="Arial" w:hAnsi="Arial"/>
-                <w:b/>
-                <w:bCs/>
-                <w:sz w:val="18"/>
-                <w:szCs w:val="18"/>
-              </w:rPr>
-              <w:t xml:space="preserve">FA</w:t>
-            </w:r>
-          </w:p>
-        </w:tc>
-        <w:tc>
-          <w:tcPr>
-            <w:tcW w:type="dxa" w:w="1600"/>
-            <w:tcBorders>
-              <w:top w:val="single" w:color="A6A6A6" w:sz="4"/>
-              <w:left w:val="single" w:color="A6A6A6" w:sz="4"/>
-              <w:bottom w:val="single" w:color="A6A6A6" w:sz="4"/>
-              <w:right w:val="single" w:color="A6A6A6" w:sz="4"/>
-            </w:tcBorders>
-            <w:shd w:fill="E7E6E6" w:color="auto" w:val="clear"/>
-            <w:tcMar>
-              <w:top w:type="dxa" w:w="45"/>
-              <w:left w:type="dxa" w:w="90"/>
-              <w:bottom w:type="dxa" w:w="45"/>
-              <w:right w:type="dxa" w:w="90"/>
-            </w:tcMar>
-            <w:vAlign w:val="center"/>
-          </w:tcPr>
-          <w:p>
-            <w:pPr>
-              <w:keepNext/>
-              <w:spacing w:after="0" w:line="250"/>
-              <w:jc w:val="center"/>
-            </w:pPr>
-            <w:r>
-              <w:rPr>
-                <w:rFonts w:ascii="Arial" w:cs="Arial" w:eastAsia="Arial" w:hAnsi="Arial"/>
-                <w:b/>
-                <w:bCs/>
-                <w:sz w:val="18"/>
-                <w:szCs w:val="18"/>
-              </w:rPr>
-              <w:t xml:space="preserve">PFA</w:t>
-            </w:r>
-          </w:p>
-        </w:tc>
-        <w:tc>
-          <w:tcPr>
-            <w:tcW w:type="dxa" w:w="1838"/>
-            <w:tcBorders>
-              <w:top w:val="single" w:color="A6A6A6" w:sz="4"/>
-              <w:left w:val="single" w:color="A6A6A6" w:sz="4"/>
-              <w:bottom w:val="single" w:color="A6A6A6" w:sz="4"/>
-              <w:right w:val="single" w:color="A6A6A6" w:sz="4"/>
-            </w:tcBorders>
-            <w:shd w:fill="E7E6E6" w:color="auto" w:val="clear"/>
-            <w:tcMar>
-              <w:top w:type="dxa" w:w="45"/>
-              <w:left w:type="dxa" w:w="90"/>
-              <w:bottom w:type="dxa" w:w="45"/>
-              <w:right w:type="dxa" w:w="90"/>
-            </w:tcMar>
-            <w:vAlign w:val="center"/>
-          </w:tcPr>
-          <w:p>
-            <w:pPr>
-              <w:keepNext/>
-              <w:spacing w:after="0" w:line="250"/>
-              <w:jc w:val="center"/>
-            </w:pPr>
-            <w:r>
-              <w:rPr>
-                <w:rFonts w:ascii="Arial" w:cs="Arial" w:eastAsia="Arial" w:hAnsi="Arial"/>
-                <w:b/>
-                <w:bCs/>
-                <w:sz w:val="18"/>
-                <w:szCs w:val="18"/>
-              </w:rPr>
-              <w:t xml:space="preserve">Funções</w:t>
-            </w:r>
-          </w:p>
-        </w:tc>
-      </w:tr>
-      <w:tr>
-        <w:trPr>
-          <w:cantSplit/>
-        </w:trPr>
-        <w:tc>
-          <w:tcPr>
-            <w:tcW w:type="dxa" w:w="3000"/>
-            <w:tcBorders>
-              <w:top w:val="single" w:color="A6A6A6" w:sz="4"/>
-              <w:left w:val="single" w:color="A6A6A6" w:sz="4"/>
-              <w:bottom w:val="single" w:color="A6A6A6" w:sz="4"/>
-              <w:right w:val="single" w:color="A6A6A6" w:sz="4"/>
-            </w:tcBorders>
-            <w:tcMar>
-              <w:top w:type="dxa" w:w="45"/>
-              <w:left w:type="dxa" w:w="90"/>
-              <w:bottom w:type="dxa" w:w="45"/>
-              <w:right w:type="dxa" w:w="90"/>
-            </w:tcMar>
-            <w:vAlign w:val="center"/>
-          </w:tcPr>
-          <w:p>
-            <w:pPr>
-              <w:spacing w:after="0" w:line="250"/>
-            </w:pPr>
-            <w:r>
-              <w:rPr>
-                <w:rFonts w:ascii="Arial" w:cs="Arial" w:eastAsia="Arial" w:hAnsi="Arial"/>
-                <w:b/>
-                <w:bCs/>
-                <w:sz w:val="18"/>
-                <w:szCs w:val="18"/>
-              </w:rPr>
-              <w:t xml:space="preserve">Eduardo Lourenço da Silva</w:t>
-            </w:r>
-          </w:p>
-        </w:tc>
-        <w:tc>
-          <w:tcPr>
-            <w:tcW w:type="dxa" w:w="1600"/>
-            <w:tcBorders>
-              <w:top w:val="single" w:color="A6A6A6" w:sz="4"/>
-              <w:left w:val="single" w:color="A6A6A6" w:sz="4"/>
-              <w:bottom w:val="single" w:color="A6A6A6" w:sz="4"/>
-              <w:right w:val="single" w:color="A6A6A6" w:sz="4"/>
-            </w:tcBorders>
-            <w:tcMar>
-              <w:top w:type="dxa" w:w="45"/>
-              <w:left w:type="dxa" w:w="90"/>
-              <w:bottom w:type="dxa" w:w="45"/>
-              <w:right w:type="dxa" w:w="90"/>
-            </w:tcMar>
-            <w:vAlign w:val="center"/>
-          </w:tcPr>
-          <w:p>
-            <w:pPr>
-              <w:spacing w:after="0" w:line="250"/>
-              <w:jc w:val="center"/>
-            </w:pPr>
-            <w:r>
-              <w:rPr>
-                <w:rFonts w:ascii="Arial" w:cs="Arial" w:eastAsia="Arial" w:hAnsi="Arial"/>
-                <w:sz w:val="18"/>
-                <w:szCs w:val="18"/>
-              </w:rPr>
-              <w:t xml:space="preserve">58</w:t>
-            </w:r>
-          </w:p>
-        </w:tc>
-        <w:tc>
-          <w:tcPr>
-            <w:tcW w:type="dxa" w:w="1600"/>
-            <w:tcBorders>
-              <w:top w:val="single" w:color="A6A6A6" w:sz="4"/>
-              <w:left w:val="single" w:color="A6A6A6" w:sz="4"/>
-              <w:bottom w:val="single" w:color="A6A6A6" w:sz="4"/>
-              <w:right w:val="single" w:color="A6A6A6" w:sz="4"/>
-            </w:tcBorders>
-            <w:tcMar>
-              <w:top w:type="dxa" w:w="45"/>
-              <w:left w:type="dxa" w:w="90"/>
-              <w:bottom w:type="dxa" w:w="45"/>
-              <w:right w:type="dxa" w:w="90"/>
-            </w:tcMar>
-            <w:vAlign w:val="center"/>
-          </w:tcPr>
-          <w:p>
-            <w:pPr>
-              <w:spacing w:after="0" w:line="250"/>
-              <w:jc w:val="center"/>
-            </w:pPr>
-            <w:r>
-              <w:rPr>
-                <w:rFonts w:ascii="Arial" w:cs="Arial" w:eastAsia="Arial" w:hAnsi="Arial"/>
-                <w:sz w:val="18"/>
-                <w:szCs w:val="18"/>
-              </w:rPr>
-              <w:t xml:space="preserve">1,07</w:t>
-            </w:r>
-          </w:p>
-        </w:tc>
-        <w:tc>
-          <w:tcPr>
-            <w:tcW w:type="dxa" w:w="1600"/>
-            <w:tcBorders>
-              <w:top w:val="single" w:color="A6A6A6" w:sz="4"/>
-              <w:left w:val="single" w:color="A6A6A6" w:sz="4"/>
-              <w:bottom w:val="single" w:color="A6A6A6" w:sz="4"/>
-              <w:right w:val="single" w:color="A6A6A6" w:sz="4"/>
-            </w:tcBorders>
-            <w:tcMar>
-              <w:top w:type="dxa" w:w="45"/>
-              <w:left w:type="dxa" w:w="90"/>
-              <w:bottom w:type="dxa" w:w="45"/>
-              <w:right w:type="dxa" w:w="90"/>
-            </w:tcMar>
-            <w:vAlign w:val="center"/>
-          </w:tcPr>
-          <w:p>
-            <w:pPr>
-              <w:spacing w:after="0" w:line="250"/>
-              <w:jc w:val="center"/>
-            </w:pPr>
-            <w:r>
-              <w:rPr>
-                <w:rFonts w:ascii="Arial" w:cs="Arial" w:eastAsia="Arial" w:hAnsi="Arial"/>
-                <w:sz w:val="18"/>
-                <w:szCs w:val="18"/>
-              </w:rPr>
-              <w:t xml:space="preserve">62,06</w:t>
-            </w:r>
-          </w:p>
-        </w:tc>
-        <w:tc>
-          <w:tcPr>
-            <w:tcW w:type="dxa" w:w="1838"/>
-            <w:tcBorders>
-              <w:top w:val="single" w:color="A6A6A6" w:sz="4"/>
-              <w:left w:val="single" w:color="A6A6A6" w:sz="4"/>
-              <w:bottom w:val="single" w:color="A6A6A6" w:sz="4"/>
-              <w:right w:val="single" w:color="A6A6A6" w:sz="4"/>
-            </w:tcBorders>
-            <w:tcMar>
-              <w:top w:type="dxa" w:w="45"/>
-              <w:left w:type="dxa" w:w="90"/>
-              <w:bottom w:type="dxa" w:w="45"/>
-              <w:right w:type="dxa" w:w="90"/>
-            </w:tcMar>
-            <w:vAlign w:val="center"/>
-          </w:tcPr>
-          <w:p>
-            <w:pPr>
-              <w:spacing w:after="0" w:line="250"/>
-              <w:jc w:val="center"/>
-            </w:pPr>
-            <w:r>
-              <w:rPr>
-                <w:rFonts w:ascii="Arial" w:cs="Arial" w:eastAsia="Arial" w:hAnsi="Arial"/>
-                <w:sz w:val="18"/>
-                <w:szCs w:val="18"/>
-              </w:rPr>
-              <w:t xml:space="preserve">12</w:t>
-            </w:r>
-          </w:p>
-        </w:tc>
-      </w:tr>
-      <w:tr>
-        <w:trPr>
-          <w:cantSplit/>
-        </w:trPr>
-        <w:tc>
-          <w:tcPr>
-            <w:tcW w:type="dxa" w:w="3000"/>
-            <w:tcBorders>
-              <w:top w:val="single" w:color="A6A6A6" w:sz="4"/>
-              <w:left w:val="single" w:color="A6A6A6" w:sz="4"/>
-              <w:bottom w:val="single" w:color="A6A6A6" w:sz="4"/>
-              <w:right w:val="single" w:color="A6A6A6" w:sz="4"/>
-            </w:tcBorders>
-            <w:tcMar>
-              <w:top w:type="dxa" w:w="45"/>
-              <w:left w:type="dxa" w:w="90"/>
-              <w:bottom w:type="dxa" w:w="45"/>
-              <w:right w:type="dxa" w:w="90"/>
-            </w:tcMar>
-            <w:vAlign w:val="center"/>
-          </w:tcPr>
-          <w:p>
-            <w:pPr>
-              <w:spacing w:after="0" w:line="250"/>
-            </w:pPr>
-            <w:r>
-              <w:rPr>
-                <w:rFonts w:ascii="Arial" w:cs="Arial" w:eastAsia="Arial" w:hAnsi="Arial"/>
-                <w:b/>
-                <w:bCs/>
-                <w:sz w:val="18"/>
-                <w:szCs w:val="18"/>
-              </w:rPr>
-              <w:t xml:space="preserve">Gabriel Pereira Lugon Moulin</w:t>
-            </w:r>
-          </w:p>
-        </w:tc>
-        <w:tc>
-          <w:tcPr>
-            <w:tcW w:type="dxa" w:w="1600"/>
-            <w:tcBorders>
-              <w:top w:val="single" w:color="A6A6A6" w:sz="4"/>
-              <w:left w:val="single" w:color="A6A6A6" w:sz="4"/>
-              <w:bottom w:val="single" w:color="A6A6A6" w:sz="4"/>
-              <w:right w:val="single" w:color="A6A6A6" w:sz="4"/>
-            </w:tcBorders>
-            <w:tcMar>
-              <w:top w:type="dxa" w:w="45"/>
-              <w:left w:type="dxa" w:w="90"/>
-              <w:bottom w:type="dxa" w:w="45"/>
-              <w:right w:type="dxa" w:w="90"/>
-            </w:tcMar>
-            <w:vAlign w:val="center"/>
-          </w:tcPr>
-          <w:p>
-            <w:pPr>
-              <w:spacing w:after="0" w:line="250"/>
-              <w:jc w:val="center"/>
-            </w:pPr>
-            <w:r>
-              <w:rPr>
-                <w:rFonts w:ascii="Arial" w:cs="Arial" w:eastAsia="Arial" w:hAnsi="Arial"/>
-                <w:sz w:val="18"/>
-                <w:szCs w:val="18"/>
-              </w:rPr>
-              <w:t xml:space="preserve">57</w:t>
-            </w:r>
-          </w:p>
-        </w:tc>
-        <w:tc>
-          <w:tcPr>
-            <w:tcW w:type="dxa" w:w="1600"/>
-            <w:tcBorders>
-              <w:top w:val="single" w:color="A6A6A6" w:sz="4"/>
-              <w:left w:val="single" w:color="A6A6A6" w:sz="4"/>
-              <w:bottom w:val="single" w:color="A6A6A6" w:sz="4"/>
-              <w:right w:val="single" w:color="A6A6A6" w:sz="4"/>
-            </w:tcBorders>
-            <w:tcMar>
-              <w:top w:type="dxa" w:w="45"/>
-              <w:left w:type="dxa" w:w="90"/>
-              <w:bottom w:type="dxa" w:w="45"/>
-              <w:right w:type="dxa" w:w="90"/>
-            </w:tcMar>
-            <w:vAlign w:val="center"/>
-          </w:tcPr>
-          <w:p>
-            <w:pPr>
-              <w:spacing w:after="0" w:line="250"/>
-              <w:jc w:val="center"/>
-            </w:pPr>
-            <w:r>
-              <w:rPr>
-                <w:rFonts w:ascii="Arial" w:cs="Arial" w:eastAsia="Arial" w:hAnsi="Arial"/>
-                <w:sz w:val="18"/>
-                <w:szCs w:val="18"/>
-              </w:rPr>
-              <w:t xml:space="preserve">1,07</w:t>
-            </w:r>
-          </w:p>
-        </w:tc>
-        <w:tc>
-          <w:tcPr>
-            <w:tcW w:type="dxa" w:w="1600"/>
-            <w:tcBorders>
-              <w:top w:val="single" w:color="A6A6A6" w:sz="4"/>
-              <w:left w:val="single" w:color="A6A6A6" w:sz="4"/>
-              <w:bottom w:val="single" w:color="A6A6A6" w:sz="4"/>
-              <w:right w:val="single" w:color="A6A6A6" w:sz="4"/>
-            </w:tcBorders>
-            <w:tcMar>
-              <w:top w:type="dxa" w:w="45"/>
-              <w:left w:type="dxa" w:w="90"/>
-              <w:bottom w:type="dxa" w:w="45"/>
-              <w:right w:type="dxa" w:w="90"/>
-            </w:tcMar>
-            <w:vAlign w:val="center"/>
-          </w:tcPr>
-          <w:p>
-            <w:pPr>
-              <w:spacing w:after="0" w:line="250"/>
-              <w:jc w:val="center"/>
-            </w:pPr>
-            <w:r>
-              <w:rPr>
-                <w:rFonts w:ascii="Arial" w:cs="Arial" w:eastAsia="Arial" w:hAnsi="Arial"/>
-                <w:sz w:val="18"/>
-                <w:szCs w:val="18"/>
-              </w:rPr>
-              <w:t xml:space="preserve">60,99</w:t>
-            </w:r>
-          </w:p>
-        </w:tc>
-        <w:tc>
-          <w:tcPr>
-            <w:tcW w:type="dxa" w:w="1838"/>
-            <w:tcBorders>
-              <w:top w:val="single" w:color="A6A6A6" w:sz="4"/>
-              <w:left w:val="single" w:color="A6A6A6" w:sz="4"/>
-              <w:bottom w:val="single" w:color="A6A6A6" w:sz="4"/>
-              <w:right w:val="single" w:color="A6A6A6" w:sz="4"/>
-            </w:tcBorders>
-            <w:tcMar>
-              <w:top w:type="dxa" w:w="45"/>
-              <w:left w:type="dxa" w:w="90"/>
-              <w:bottom w:type="dxa" w:w="45"/>
-              <w:right w:type="dxa" w:w="90"/>
-            </w:tcMar>
-            <w:vAlign w:val="center"/>
-          </w:tcPr>
-          <w:p>
-            <w:pPr>
-              <w:spacing w:after="0" w:line="250"/>
-              <w:jc w:val="center"/>
-            </w:pPr>
-            <w:r>
-              <w:rPr>
-                <w:rFonts w:ascii="Arial" w:cs="Arial" w:eastAsia="Arial" w:hAnsi="Arial"/>
-                <w:sz w:val="18"/>
-                <w:szCs w:val="18"/>
-              </w:rPr>
-              <w:t xml:space="preserve">12</w:t>
-            </w:r>
-          </w:p>
-        </w:tc>
-      </w:tr>
-      <w:tr>
-        <w:trPr>
-          <w:cantSplit/>
-        </w:trPr>
-        <w:tc>
-          <w:tcPr>
-            <w:tcW w:type="dxa" w:w="3000"/>
-            <w:tcBorders>
-              <w:top w:val="single" w:color="A6A6A6" w:sz="4"/>
-              <w:left w:val="single" w:color="A6A6A6" w:sz="4"/>
-              <w:bottom w:val="single" w:color="A6A6A6" w:sz="4"/>
-              <w:right w:val="single" w:color="A6A6A6" w:sz="4"/>
-            </w:tcBorders>
-            <w:tcMar>
-              <w:top w:type="dxa" w:w="45"/>
-              <w:left w:type="dxa" w:w="90"/>
-              <w:bottom w:type="dxa" w:w="45"/>
-              <w:right w:type="dxa" w:w="90"/>
-            </w:tcMar>
-            <w:vAlign w:val="center"/>
-          </w:tcPr>
-          <w:p>
-            <w:pPr>
-              <w:spacing w:after="0" w:line="250"/>
-            </w:pPr>
-            <w:r>
-              <w:rPr>
-                <w:rFonts w:ascii="Arial" w:cs="Arial" w:eastAsia="Arial" w:hAnsi="Arial"/>
-                <w:b/>
-                <w:bCs/>
-                <w:sz w:val="18"/>
-                <w:szCs w:val="18"/>
-              </w:rPr>
-              <w:t xml:space="preserve">João Pedro Novak Rausis</w:t>
-            </w:r>
-          </w:p>
-        </w:tc>
-        <w:tc>
-          <w:tcPr>
-            <w:tcW w:type="dxa" w:w="1600"/>
-            <w:tcBorders>
-              <w:top w:val="single" w:color="A6A6A6" w:sz="4"/>
-              <w:left w:val="single" w:color="A6A6A6" w:sz="4"/>
-              <w:bottom w:val="single" w:color="A6A6A6" w:sz="4"/>
-              <w:right w:val="single" w:color="A6A6A6" w:sz="4"/>
-            </w:tcBorders>
-            <w:tcMar>
-              <w:top w:type="dxa" w:w="45"/>
-              <w:left w:type="dxa" w:w="90"/>
-              <w:bottom w:type="dxa" w:w="45"/>
-              <w:right w:type="dxa" w:w="90"/>
-            </w:tcMar>
-            <w:vAlign w:val="center"/>
-          </w:tcPr>
-          <w:p>
-            <w:pPr>
-              <w:spacing w:after="0" w:line="250"/>
-              <w:jc w:val="center"/>
-            </w:pPr>
-            <w:r>
-              <w:rPr>
-                <w:rFonts w:ascii="Arial" w:cs="Arial" w:eastAsia="Arial" w:hAnsi="Arial"/>
-                <w:sz w:val="18"/>
-                <w:szCs w:val="18"/>
-              </w:rPr>
-              <w:t xml:space="preserve">58</w:t>
-            </w:r>
-          </w:p>
-        </w:tc>
-        <w:tc>
-          <w:tcPr>
-            <w:tcW w:type="dxa" w:w="1600"/>
-            <w:tcBorders>
-              <w:top w:val="single" w:color="A6A6A6" w:sz="4"/>
-              <w:left w:val="single" w:color="A6A6A6" w:sz="4"/>
-              <w:bottom w:val="single" w:color="A6A6A6" w:sz="4"/>
-              <w:right w:val="single" w:color="A6A6A6" w:sz="4"/>
-            </w:tcBorders>
-            <w:tcMar>
-              <w:top w:type="dxa" w:w="45"/>
-              <w:left w:type="dxa" w:w="90"/>
-              <w:bottom w:type="dxa" w:w="45"/>
-              <w:right w:type="dxa" w:w="90"/>
-            </w:tcMar>
-            <w:vAlign w:val="center"/>
-          </w:tcPr>
-          <w:p>
-            <w:pPr>
-              <w:spacing w:after="0" w:line="250"/>
-              <w:jc w:val="center"/>
-            </w:pPr>
-            <w:r>
-              <w:rPr>
-                <w:rFonts w:ascii="Arial" w:cs="Arial" w:eastAsia="Arial" w:hAnsi="Arial"/>
-                <w:sz w:val="18"/>
-                <w:szCs w:val="18"/>
-              </w:rPr>
-              <w:t xml:space="preserve">1,07</w:t>
-            </w:r>
-          </w:p>
-        </w:tc>
-        <w:tc>
-          <w:tcPr>
-            <w:tcW w:type="dxa" w:w="1600"/>
-            <w:tcBorders>
-              <w:top w:val="single" w:color="A6A6A6" w:sz="4"/>
-              <w:left w:val="single" w:color="A6A6A6" w:sz="4"/>
-              <w:bottom w:val="single" w:color="A6A6A6" w:sz="4"/>
-              <w:right w:val="single" w:color="A6A6A6" w:sz="4"/>
-            </w:tcBorders>
-            <w:tcMar>
-              <w:top w:type="dxa" w:w="45"/>
-              <w:left w:type="dxa" w:w="90"/>
-              <w:bottom w:type="dxa" w:w="45"/>
-              <w:right w:type="dxa" w:w="90"/>
-            </w:tcMar>
-            <w:vAlign w:val="center"/>
-          </w:tcPr>
-          <w:p>
-            <w:pPr>
-              <w:spacing w:after="0" w:line="250"/>
-              <w:jc w:val="center"/>
-            </w:pPr>
-            <w:r>
-              <w:rPr>
-                <w:rFonts w:ascii="Arial" w:cs="Arial" w:eastAsia="Arial" w:hAnsi="Arial"/>
-                <w:sz w:val="18"/>
-                <w:szCs w:val="18"/>
-              </w:rPr>
-              <w:t xml:space="preserve">62,06</w:t>
-            </w:r>
-          </w:p>
-        </w:tc>
-        <w:tc>
-          <w:tcPr>
-            <w:tcW w:type="dxa" w:w="1838"/>
-            <w:tcBorders>
-              <w:top w:val="single" w:color="A6A6A6" w:sz="4"/>
-              <w:left w:val="single" w:color="A6A6A6" w:sz="4"/>
-              <w:bottom w:val="single" w:color="A6A6A6" w:sz="4"/>
-              <w:right w:val="single" w:color="A6A6A6" w:sz="4"/>
-            </w:tcBorders>
-            <w:tcMar>
-              <w:top w:type="dxa" w:w="45"/>
-              <w:left w:type="dxa" w:w="90"/>
-              <w:bottom w:type="dxa" w:w="45"/>
-              <w:right w:type="dxa" w:w="90"/>
-            </w:tcMar>
-            <w:vAlign w:val="center"/>
-          </w:tcPr>
-          <w:p>
-            <w:pPr>
-              <w:spacing w:after="0" w:line="250"/>
-              <w:jc w:val="center"/>
-            </w:pPr>
-            <w:r>
-              <w:rPr>
-                <w:rFonts w:ascii="Arial" w:cs="Arial" w:eastAsia="Arial" w:hAnsi="Arial"/>
-                <w:sz w:val="18"/>
-                <w:szCs w:val="18"/>
-              </w:rPr>
-              <w:t xml:space="preserve">12</w:t>
-            </w:r>
-          </w:p>
-        </w:tc>
-      </w:tr>
-      <w:tr>
-        <w:tc>
-          <w:tcPr>
-            <w:tcW w:type="dxa" w:w="3000"/>
-            <w:tcBorders>
-              <w:top w:val="single" w:color="A6A6A6" w:sz="4"/>
-              <w:left w:val="single" w:color="A6A6A6" w:sz="4"/>
-              <w:bottom w:val="single" w:color="A6A6A6" w:sz="4"/>
-              <w:right w:val="single" w:color="A6A6A6" w:sz="4"/>
-            </w:tcBorders>
-            <w:shd w:fill="E7E6E6" w:color="auto" w:val="clear"/>
-            <w:tcMar>
-              <w:top w:type="dxa" w:w="45"/>
-              <w:left w:type="dxa" w:w="90"/>
-              <w:bottom w:type="dxa" w:w="45"/>
-              <w:right w:type="dxa" w:w="90"/>
-            </w:tcMar>
-            <w:vAlign w:val="center"/>
-          </w:tcPr>
-          <w:p>
-            <w:pPr>
-              <w:spacing w:after="0" w:line="250"/>
-            </w:pPr>
-            <w:r>
-              <w:rPr>
-                <w:rFonts w:ascii="Arial" w:cs="Arial" w:eastAsia="Arial" w:hAnsi="Arial"/>
-                <w:b/>
-                <w:bCs/>
-                <w:sz w:val="18"/>
-                <w:szCs w:val="18"/>
-              </w:rPr>
-              <w:t xml:space="preserve">Equipe</w:t>
-            </w:r>
-          </w:p>
-        </w:tc>
-        <w:tc>
-          <w:tcPr>
-            <w:tcW w:type="dxa" w:w="1600"/>
-            <w:tcBorders>
-              <w:top w:val="single" w:color="A6A6A6" w:sz="4"/>
-              <w:left w:val="single" w:color="A6A6A6" w:sz="4"/>
-              <w:bottom w:val="single" w:color="A6A6A6" w:sz="4"/>
-              <w:right w:val="single" w:color="A6A6A6" w:sz="4"/>
-            </w:tcBorders>
-            <w:shd w:fill="E7E6E6" w:color="auto" w:val="clear"/>
-            <w:tcMar>
-              <w:top w:type="dxa" w:w="45"/>
-              <w:left w:type="dxa" w:w="90"/>
-              <w:bottom w:type="dxa" w:w="45"/>
-              <w:right w:type="dxa" w:w="90"/>
-            </w:tcMar>
-            <w:vAlign w:val="center"/>
-          </w:tcPr>
-          <w:p>
-            <w:pPr>
-              <w:spacing w:after="0" w:line="250"/>
-              <w:jc w:val="center"/>
-            </w:pPr>
-            <w:r>
-              <w:rPr>
-                <w:rFonts w:ascii="Arial" w:cs="Arial" w:eastAsia="Arial" w:hAnsi="Arial"/>
-                <w:b/>
-                <w:bCs/>
-                <w:sz w:val="18"/>
-                <w:szCs w:val="18"/>
-              </w:rPr>
-              <w:t xml:space="preserve">173</w:t>
-            </w:r>
-          </w:p>
-        </w:tc>
-        <w:tc>
-          <w:tcPr>
-            <w:tcW w:type="dxa" w:w="1600"/>
-            <w:tcBorders>
-              <w:top w:val="single" w:color="A6A6A6" w:sz="4"/>
-              <w:left w:val="single" w:color="A6A6A6" w:sz="4"/>
-              <w:bottom w:val="single" w:color="A6A6A6" w:sz="4"/>
-              <w:right w:val="single" w:color="A6A6A6" w:sz="4"/>
-            </w:tcBorders>
-            <w:shd w:fill="E7E6E6" w:color="auto" w:val="clear"/>
-            <w:tcMar>
-              <w:top w:type="dxa" w:w="45"/>
-              <w:left w:type="dxa" w:w="90"/>
-              <w:bottom w:type="dxa" w:w="45"/>
-              <w:right w:type="dxa" w:w="90"/>
-            </w:tcMar>
-            <w:vAlign w:val="center"/>
-          </w:tcPr>
-          <w:p>
-            <w:pPr>
-              <w:spacing w:after="0" w:line="250"/>
-              <w:jc w:val="center"/>
-            </w:pPr>
-            <w:r>
-              <w:rPr>
-                <w:rFonts w:ascii="Arial" w:cs="Arial" w:eastAsia="Arial" w:hAnsi="Arial"/>
-                <w:b/>
-                <w:bCs/>
-                <w:sz w:val="18"/>
-                <w:szCs w:val="18"/>
-              </w:rPr>
-              <w:t xml:space="preserve">1,07</w:t>
-            </w:r>
-          </w:p>
-        </w:tc>
-        <w:tc>
-          <w:tcPr>
-            <w:tcW w:type="dxa" w:w="1600"/>
-            <w:tcBorders>
-              <w:top w:val="single" w:color="A6A6A6" w:sz="4"/>
-              <w:left w:val="single" w:color="A6A6A6" w:sz="4"/>
-              <w:bottom w:val="single" w:color="A6A6A6" w:sz="4"/>
-              <w:right w:val="single" w:color="A6A6A6" w:sz="4"/>
-            </w:tcBorders>
-            <w:shd w:fill="E7E6E6" w:color="auto" w:val="clear"/>
-            <w:tcMar>
-              <w:top w:type="dxa" w:w="45"/>
-              <w:left w:type="dxa" w:w="90"/>
-              <w:bottom w:type="dxa" w:w="45"/>
-              <w:right w:type="dxa" w:w="90"/>
-            </w:tcMar>
-            <w:vAlign w:val="center"/>
-          </w:tcPr>
-          <w:p>
-            <w:pPr>
-              <w:spacing w:after="0" w:line="250"/>
-              <w:jc w:val="center"/>
-            </w:pPr>
-            <w:r>
-              <w:rPr>
-                <w:rFonts w:ascii="Arial" w:cs="Arial" w:eastAsia="Arial" w:hAnsi="Arial"/>
-                <w:b/>
-                <w:bCs/>
-                <w:sz w:val="18"/>
-                <w:szCs w:val="18"/>
-              </w:rPr>
-              <w:t xml:space="preserve">185,11</w:t>
-            </w:r>
-          </w:p>
-        </w:tc>
-        <w:tc>
-          <w:tcPr>
-            <w:tcW w:type="dxa" w:w="1838"/>
-            <w:tcBorders>
-              <w:top w:val="single" w:color="A6A6A6" w:sz="4"/>
-              <w:left w:val="single" w:color="A6A6A6" w:sz="4"/>
-              <w:bottom w:val="single" w:color="A6A6A6" w:sz="4"/>
-              <w:right w:val="single" w:color="A6A6A6" w:sz="4"/>
-            </w:tcBorders>
-            <w:shd w:fill="E7E6E6" w:color="auto" w:val="clear"/>
-            <w:tcMar>
-              <w:top w:type="dxa" w:w="45"/>
-              <w:left w:type="dxa" w:w="90"/>
-              <w:bottom w:type="dxa" w:w="45"/>
-              <w:right w:type="dxa" w:w="90"/>
-            </w:tcMar>
-            <w:vAlign w:val="center"/>
-          </w:tcPr>
-          <w:p>
-            <w:pPr>
-              <w:spacing w:after="0" w:line="250"/>
-              <w:jc w:val="center"/>
-            </w:pPr>
-            <w:r>
-              <w:rPr>
-                <w:rFonts w:ascii="Arial" w:cs="Arial" w:eastAsia="Arial" w:hAnsi="Arial"/>
-                <w:b/>
-                <w:bCs/>
-                <w:sz w:val="18"/>
-                <w:szCs w:val="18"/>
-              </w:rPr>
-              <w:t xml:space="preserve">36</w:t>
-            </w:r>
-          </w:p>
-        </w:tc>
-      </w:tr>
-    </w:tbl>
-    <w:p>
-      <w:pPr>
-        <w:pStyle w:val="Heading2"/>
-        <w:keepNext/>
-        <w:pageBreakBefore/>
-        <w:spacing w:after="80" w:before="0"/>
-      </w:pPr>
-      <w:r>
-        <w:rPr>
-          <w:rFonts w:ascii="Arial" w:cs="Arial" w:eastAsia="Arial" w:hAnsi="Arial"/>
-          <w:b/>
-          <w:bCs/>
-          <w:color w:val="2F5496"/>
-          <w:sz w:val="24"/>
-          <w:szCs w:val="24"/>
-        </w:rPr>
-        <w:t xml:space="preserve">6.2 Nível de influência (NI)</w:t>
-      </w:r>
-    </w:p>
-    <w:tbl>
-      <w:tblPr>
-        <w:tblW w:type="dxa" w:w="9638"/>
-        <w:tblBorders>
-          <w:top w:val="single" w:color="auto" w:sz="4"/>
-          <w:left w:val="single" w:color="auto" w:sz="4"/>
-          <w:bottom w:val="single" w:color="auto" w:sz="4"/>
-          <w:right w:val="single" w:color="auto" w:sz="4"/>
-          <w:insideH w:val="single" w:color="auto" w:sz="4"/>
-          <w:insideV w:val="single" w:color="auto" w:sz="4"/>
-        </w:tblBorders>
-      </w:tblPr>
-      <w:tblGrid>
-        <w:gridCol w:w="500"/>
-        <w:gridCol w:w="2500"/>
-        <w:gridCol w:w="700"/>
-        <w:gridCol w:w="5938"/>
-      </w:tblGrid>
-      <w:tr>
-        <w:trPr>
-          <w:cantSplit/>
-          <w:tblHeader/>
-        </w:trPr>
-        <w:tc>
-          <w:tcPr>
-            <w:tcW w:type="dxa" w:w="500"/>
-            <w:tcBorders>
-              <w:top w:val="single" w:color="A6A6A6" w:sz="4"/>
-              <w:left w:val="single" w:color="A6A6A6" w:sz="4"/>
-              <w:bottom w:val="single" w:color="A6A6A6" w:sz="4"/>
-              <w:right w:val="single" w:color="A6A6A6" w:sz="4"/>
-            </w:tcBorders>
-            <w:shd w:fill="E7E6E6" w:color="auto" w:val="clear"/>
-            <w:tcMar>
-              <w:top w:type="dxa" w:w="45"/>
-              <w:left w:type="dxa" w:w="90"/>
-              <w:bottom w:type="dxa" w:w="45"/>
-              <w:right w:type="dxa" w:w="90"/>
-            </w:tcMar>
-            <w:vAlign w:val="center"/>
-          </w:tcPr>
-          <w:p>
-            <w:pPr>
-              <w:keepNext/>
-              <w:spacing w:after="0" w:line="250"/>
-              <w:jc w:val="left"/>
-            </w:pPr>
-            <w:r>
-              <w:rPr>
-                <w:rFonts w:ascii="Arial" w:cs="Arial" w:eastAsia="Arial" w:hAnsi="Arial"/>
-                <w:b/>
-                <w:bCs/>
-                <w:sz w:val="18"/>
-                <w:szCs w:val="18"/>
-              </w:rPr>
-              <w:t xml:space="preserve">Nº</w:t>
-            </w:r>
-          </w:p>
-        </w:tc>
-        <w:tc>
-          <w:tcPr>
-            <w:tcW w:type="dxa" w:w="2500"/>
-            <w:tcBorders>
-              <w:top w:val="single" w:color="A6A6A6" w:sz="4"/>
-              <w:left w:val="single" w:color="A6A6A6" w:sz="4"/>
-              <w:bottom w:val="single" w:color="A6A6A6" w:sz="4"/>
-              <w:right w:val="single" w:color="A6A6A6" w:sz="4"/>
-            </w:tcBorders>
-            <w:shd w:fill="E7E6E6" w:color="auto" w:val="clear"/>
-            <w:tcMar>
-              <w:top w:type="dxa" w:w="45"/>
-              <w:left w:type="dxa" w:w="90"/>
-              <w:bottom w:type="dxa" w:w="45"/>
-              <w:right w:type="dxa" w:w="90"/>
-            </w:tcMar>
-            <w:vAlign w:val="center"/>
-          </w:tcPr>
-          <w:p>
-            <w:pPr>
-              <w:keepNext/>
-              <w:spacing w:after="0" w:line="250"/>
-              <w:jc w:val="center"/>
-            </w:pPr>
-            <w:r>
-              <w:rPr>
-                <w:rFonts w:ascii="Arial" w:cs="Arial" w:eastAsia="Arial" w:hAnsi="Arial"/>
-                <w:b/>
-                <w:bCs/>
-                <w:sz w:val="18"/>
-                <w:szCs w:val="18"/>
-              </w:rPr>
-              <w:t xml:space="preserve">Característica</w:t>
-            </w:r>
-          </w:p>
-        </w:tc>
-        <w:tc>
-          <w:tcPr>
-            <w:tcW w:type="dxa" w:w="700"/>
-            <w:tcBorders>
-              <w:top w:val="single" w:color="A6A6A6" w:sz="4"/>
-              <w:left w:val="single" w:color="A6A6A6" w:sz="4"/>
-              <w:bottom w:val="single" w:color="A6A6A6" w:sz="4"/>
-              <w:right w:val="single" w:color="A6A6A6" w:sz="4"/>
-            </w:tcBorders>
-            <w:shd w:fill="E7E6E6" w:color="auto" w:val="clear"/>
-            <w:tcMar>
-              <w:top w:type="dxa" w:w="45"/>
-              <w:left w:type="dxa" w:w="90"/>
-              <w:bottom w:type="dxa" w:w="45"/>
-              <w:right w:type="dxa" w:w="90"/>
-            </w:tcMar>
-            <w:vAlign w:val="center"/>
-          </w:tcPr>
-          <w:p>
-            <w:pPr>
-              <w:keepNext/>
-              <w:spacing w:after="0" w:line="250"/>
-              <w:jc w:val="center"/>
-            </w:pPr>
-            <w:r>
-              <w:rPr>
-                <w:rFonts w:ascii="Arial" w:cs="Arial" w:eastAsia="Arial" w:hAnsi="Arial"/>
-                <w:b/>
-                <w:bCs/>
-                <w:sz w:val="18"/>
-                <w:szCs w:val="18"/>
-              </w:rPr>
-              <w:t xml:space="preserve">Nota</w:t>
-            </w:r>
-          </w:p>
-        </w:tc>
-        <w:tc>
-          <w:tcPr>
-            <w:tcW w:type="dxa" w:w="5938"/>
-            <w:tcBorders>
-              <w:top w:val="single" w:color="A6A6A6" w:sz="4"/>
-              <w:left w:val="single" w:color="A6A6A6" w:sz="4"/>
-              <w:bottom w:val="single" w:color="A6A6A6" w:sz="4"/>
-              <w:right w:val="single" w:color="A6A6A6" w:sz="4"/>
-            </w:tcBorders>
-            <w:shd w:fill="E7E6E6" w:color="auto" w:val="clear"/>
-            <w:tcMar>
-              <w:top w:type="dxa" w:w="45"/>
-              <w:left w:type="dxa" w:w="90"/>
-              <w:bottom w:type="dxa" w:w="45"/>
-              <w:right w:type="dxa" w:w="90"/>
-            </w:tcMar>
-            <w:vAlign w:val="center"/>
-          </w:tcPr>
-          <w:p>
-            <w:pPr>
-              <w:keepNext/>
-              <w:spacing w:after="0" w:line="250"/>
-              <w:jc w:val="center"/>
-            </w:pPr>
-            <w:r>
-              <w:rPr>
-                <w:rFonts w:ascii="Arial" w:cs="Arial" w:eastAsia="Arial" w:hAnsi="Arial"/>
-                <w:b/>
-                <w:bCs/>
-                <w:sz w:val="18"/>
-                <w:szCs w:val="18"/>
-              </w:rPr>
-              <w:t xml:space="preserve">Justificativa</w:t>
-            </w:r>
-          </w:p>
-        </w:tc>
-      </w:tr>
-      <w:tr>
-        <w:trPr>
-          <w:cantSplit/>
-        </w:trPr>
-        <w:tc>
-          <w:tcPr>
-            <w:tcW w:type="dxa" w:w="500"/>
-            <w:tcBorders>
-              <w:top w:val="single" w:color="A6A6A6" w:sz="4"/>
-              <w:left w:val="single" w:color="A6A6A6" w:sz="4"/>
-              <w:bottom w:val="single" w:color="A6A6A6" w:sz="4"/>
-              <w:right w:val="single" w:color="A6A6A6" w:sz="4"/>
-            </w:tcBorders>
-            <w:tcMar>
-              <w:top w:type="dxa" w:w="45"/>
-              <w:left w:type="dxa" w:w="90"/>
-              <w:bottom w:type="dxa" w:w="45"/>
-              <w:right w:type="dxa" w:w="90"/>
-            </w:tcMar>
-            <w:vAlign w:val="center"/>
-          </w:tcPr>
-          <w:p>
-            <w:pPr>
-              <w:spacing w:after="0" w:line="250"/>
-              <w:jc w:val="center"/>
-            </w:pPr>
-            <w:r>
-              <w:rPr>
-                <w:rFonts w:ascii="Arial" w:cs="Arial" w:eastAsia="Arial" w:hAnsi="Arial"/>
-                <w:sz w:val="18"/>
-                <w:szCs w:val="18"/>
-              </w:rPr>
-              <w:t xml:space="preserve">1</w:t>
-            </w:r>
-          </w:p>
-        </w:tc>
-        <w:tc>
-          <w:tcPr>
-            <w:tcW w:type="dxa" w:w="2500"/>
-            <w:tcBorders>
-              <w:top w:val="single" w:color="A6A6A6" w:sz="4"/>
-              <w:left w:val="single" w:color="A6A6A6" w:sz="4"/>
-              <w:bottom w:val="single" w:color="A6A6A6" w:sz="4"/>
-              <w:right w:val="single" w:color="A6A6A6" w:sz="4"/>
-            </w:tcBorders>
-            <w:tcMar>
-              <w:top w:type="dxa" w:w="30"/>
-              <w:left w:type="dxa" w:w="90"/>
-              <w:bottom w:type="dxa" w:w="30"/>
-              <w:right w:type="dxa" w:w="90"/>
-            </w:tcMar>
-            <w:vAlign w:val="center"/>
-          </w:tcPr>
-          <w:p>
-            <w:pPr>
-              <w:spacing w:after="0" w:line="250"/>
-            </w:pPr>
-            <w:r>
-              <w:rPr>
-                <w:rFonts w:ascii="Arial" w:cs="Arial" w:eastAsia="Arial" w:hAnsi="Arial"/>
-                <w:b/>
-                <w:bCs/>
-                <w:sz w:val="18"/>
-                <w:szCs w:val="18"/>
-              </w:rPr>
-              <w:t xml:space="preserve">Comunicação de dados</w:t>
-            </w:r>
-          </w:p>
-        </w:tc>
-        <w:tc>
-          <w:tcPr>
-            <w:tcW w:type="dxa" w:w="700"/>
-            <w:tcBorders>
-              <w:top w:val="single" w:color="A6A6A6" w:sz="4"/>
-              <w:left w:val="single" w:color="A6A6A6" w:sz="4"/>
-              <w:bottom w:val="single" w:color="A6A6A6" w:sz="4"/>
-              <w:right w:val="single" w:color="A6A6A6" w:sz="4"/>
-            </w:tcBorders>
-            <w:tcMar>
-              <w:top w:type="dxa" w:w="30"/>
-              <w:left w:type="dxa" w:w="90"/>
-              <w:bottom w:type="dxa" w:w="30"/>
-              <w:right w:type="dxa" w:w="90"/>
-            </w:tcMar>
-            <w:vAlign w:val="center"/>
-          </w:tcPr>
-          <w:p>
-            <w:pPr>
-              <w:spacing w:after="0" w:line="250"/>
-              <w:jc w:val="center"/>
-            </w:pPr>
-            <w:r>
-              <w:rPr>
-                <w:rFonts w:ascii="Arial" w:cs="Arial" w:eastAsia="Arial" w:hAnsi="Arial"/>
-                <w:b/>
-                <w:bCs/>
-                <w:sz w:val="18"/>
-                <w:szCs w:val="18"/>
-              </w:rPr>
-              <w:t xml:space="preserve">4</w:t>
-            </w:r>
-          </w:p>
-        </w:tc>
-        <w:tc>
-          <w:tcPr>
-            <w:tcW w:type="dxa" w:w="5938"/>
-            <w:tcBorders>
-              <w:top w:val="single" w:color="A6A6A6" w:sz="4"/>
-              <w:left w:val="single" w:color="A6A6A6" w:sz="4"/>
-              <w:bottom w:val="single" w:color="A6A6A6" w:sz="4"/>
-              <w:right w:val="single" w:color="A6A6A6" w:sz="4"/>
-            </w:tcBorders>
-            <w:tcMar>
-              <w:top w:type="dxa" w:w="30"/>
-              <w:left w:type="dxa" w:w="90"/>
-              <w:bottom w:type="dxa" w:w="30"/>
-              <w:right w:type="dxa" w:w="90"/>
-            </w:tcMar>
-            <w:vAlign w:val="center"/>
-          </w:tcPr>
-          <w:p>
-            <w:pPr>
-              <w:spacing w:after="0" w:line="250"/>
-            </w:pPr>
-            <w:r>
-              <w:rPr>
-                <w:rFonts w:ascii="Arial" w:cs="Arial" w:eastAsia="Arial" w:hAnsi="Arial"/>
-                <w:sz w:val="16"/>
-                <w:szCs w:val="16"/>
-              </w:rPr>
-              <w:t xml:space="preserve">O sistema só é acessado pelo navegador, pela internet, e conversa com vários serviços externos por API e webhooks: gateways de Pix, cartão, boleto e cripto, o DICT e a consulta de CPF. Há mais de um tipo de comunicação, mas todos sobre HTTPS.</w:t>
-            </w:r>
-          </w:p>
-        </w:tc>
-      </w:tr>
-      <w:tr>
-        <w:trPr>
-          <w:cantSplit/>
-        </w:trPr>
-        <w:tc>
-          <w:tcPr>
-            <w:tcW w:type="dxa" w:w="500"/>
-            <w:tcBorders>
-              <w:top w:val="single" w:color="A6A6A6" w:sz="4"/>
-              <w:left w:val="single" w:color="A6A6A6" w:sz="4"/>
-              <w:bottom w:val="single" w:color="A6A6A6" w:sz="4"/>
-              <w:right w:val="single" w:color="A6A6A6" w:sz="4"/>
-            </w:tcBorders>
-            <w:tcMar>
-              <w:top w:type="dxa" w:w="45"/>
-              <w:left w:type="dxa" w:w="90"/>
-              <w:bottom w:type="dxa" w:w="45"/>
-              <w:right w:type="dxa" w:w="90"/>
-            </w:tcMar>
-            <w:vAlign w:val="center"/>
-          </w:tcPr>
-          <w:p>
-            <w:pPr>
-              <w:spacing w:after="0" w:line="250"/>
-              <w:jc w:val="center"/>
-            </w:pPr>
-            <w:r>
-              <w:rPr>
-                <w:rFonts w:ascii="Arial" w:cs="Arial" w:eastAsia="Arial" w:hAnsi="Arial"/>
-                <w:sz w:val="18"/>
-                <w:szCs w:val="18"/>
-              </w:rPr>
-              <w:t xml:space="preserve">2</w:t>
-            </w:r>
-          </w:p>
-        </w:tc>
-        <w:tc>
-          <w:tcPr>
-            <w:tcW w:type="dxa" w:w="2500"/>
-            <w:tcBorders>
-              <w:top w:val="single" w:color="A6A6A6" w:sz="4"/>
-              <w:left w:val="single" w:color="A6A6A6" w:sz="4"/>
-              <w:bottom w:val="single" w:color="A6A6A6" w:sz="4"/>
-              <w:right w:val="single" w:color="A6A6A6" w:sz="4"/>
-            </w:tcBorders>
-            <w:tcMar>
-              <w:top w:type="dxa" w:w="30"/>
-              <w:left w:type="dxa" w:w="90"/>
-              <w:bottom w:type="dxa" w:w="30"/>
-              <w:right w:type="dxa" w:w="90"/>
-            </w:tcMar>
-            <w:vAlign w:val="center"/>
-          </w:tcPr>
-          <w:p>
-            <w:pPr>
-              <w:spacing w:after="0" w:line="250"/>
-            </w:pPr>
-            <w:r>
-              <w:rPr>
-                <w:rFonts w:ascii="Arial" w:cs="Arial" w:eastAsia="Arial" w:hAnsi="Arial"/>
-                <w:b/>
-                <w:bCs/>
-                <w:sz w:val="18"/>
-                <w:szCs w:val="18"/>
-              </w:rPr>
-              <w:t xml:space="preserve">Processamento distribuído de dados</w:t>
-            </w:r>
-          </w:p>
-        </w:tc>
-        <w:tc>
-          <w:tcPr>
-            <w:tcW w:type="dxa" w:w="700"/>
-            <w:tcBorders>
-              <w:top w:val="single" w:color="A6A6A6" w:sz="4"/>
-              <w:left w:val="single" w:color="A6A6A6" w:sz="4"/>
-              <w:bottom w:val="single" w:color="A6A6A6" w:sz="4"/>
-              <w:right w:val="single" w:color="A6A6A6" w:sz="4"/>
-            </w:tcBorders>
-            <w:tcMar>
-              <w:top w:type="dxa" w:w="30"/>
-              <w:left w:type="dxa" w:w="90"/>
-              <w:bottom w:type="dxa" w:w="30"/>
-              <w:right w:type="dxa" w:w="90"/>
-            </w:tcMar>
-            <w:vAlign w:val="center"/>
-          </w:tcPr>
-          <w:p>
-            <w:pPr>
-              <w:spacing w:after="0" w:line="250"/>
-              <w:jc w:val="center"/>
-            </w:pPr>
-            <w:r>
-              <w:rPr>
-                <w:rFonts w:ascii="Arial" w:cs="Arial" w:eastAsia="Arial" w:hAnsi="Arial"/>
-                <w:b/>
-                <w:bCs/>
-                <w:sz w:val="18"/>
-                <w:szCs w:val="18"/>
-              </w:rPr>
-              <w:t xml:space="preserve">2</w:t>
-            </w:r>
-          </w:p>
-        </w:tc>
-        <w:tc>
-          <w:tcPr>
-            <w:tcW w:type="dxa" w:w="5938"/>
-            <w:tcBorders>
-              <w:top w:val="single" w:color="A6A6A6" w:sz="4"/>
-              <w:left w:val="single" w:color="A6A6A6" w:sz="4"/>
-              <w:bottom w:val="single" w:color="A6A6A6" w:sz="4"/>
-              <w:right w:val="single" w:color="A6A6A6" w:sz="4"/>
-            </w:tcBorders>
-            <w:tcMar>
-              <w:top w:type="dxa" w:w="30"/>
-              <w:left w:type="dxa" w:w="90"/>
-              <w:bottom w:type="dxa" w:w="30"/>
-              <w:right w:type="dxa" w:w="90"/>
-            </w:tcMar>
-            <w:vAlign w:val="center"/>
-          </w:tcPr>
-          <w:p>
-            <w:pPr>
-              <w:spacing w:after="0" w:line="250"/>
-            </w:pPr>
-            <w:r>
-              <w:rPr>
-                <w:rFonts w:ascii="Arial" w:cs="Arial" w:eastAsia="Arial" w:hAnsi="Arial"/>
-                <w:sz w:val="16"/>
-                <w:szCs w:val="16"/>
-              </w:rPr>
-              <w:t xml:space="preserve">A aplicação e o banco são centralizados em um único ambiente em nuvem. Só a validação de pagamentos e a consulta de chaves e CPF ocorrem em serviços de terceiros.</w:t>
-            </w:r>
-          </w:p>
-        </w:tc>
-      </w:tr>
-      <w:tr>
-        <w:trPr>
-          <w:cantSplit/>
-        </w:trPr>
-        <w:tc>
-          <w:tcPr>
-            <w:tcW w:type="dxa" w:w="500"/>
-            <w:tcBorders>
-              <w:top w:val="single" w:color="A6A6A6" w:sz="4"/>
-              <w:left w:val="single" w:color="A6A6A6" w:sz="4"/>
-              <w:bottom w:val="single" w:color="A6A6A6" w:sz="4"/>
-              <w:right w:val="single" w:color="A6A6A6" w:sz="4"/>
-            </w:tcBorders>
-            <w:tcMar>
-              <w:top w:type="dxa" w:w="45"/>
-              <w:left w:type="dxa" w:w="90"/>
-              <w:bottom w:type="dxa" w:w="45"/>
-              <w:right w:type="dxa" w:w="90"/>
-            </w:tcMar>
-            <w:vAlign w:val="center"/>
-          </w:tcPr>
-          <w:p>
-            <w:pPr>
-              <w:spacing w:after="0" w:line="250"/>
-              <w:jc w:val="center"/>
-            </w:pPr>
-            <w:r>
-              <w:rPr>
-                <w:rFonts w:ascii="Arial" w:cs="Arial" w:eastAsia="Arial" w:hAnsi="Arial"/>
-                <w:sz w:val="18"/>
-                <w:szCs w:val="18"/>
-              </w:rPr>
-              <w:t xml:space="preserve">3</w:t>
-            </w:r>
-          </w:p>
-        </w:tc>
-        <w:tc>
-          <w:tcPr>
-            <w:tcW w:type="dxa" w:w="2500"/>
-            <w:tcBorders>
-              <w:top w:val="single" w:color="A6A6A6" w:sz="4"/>
-              <w:left w:val="single" w:color="A6A6A6" w:sz="4"/>
-              <w:bottom w:val="single" w:color="A6A6A6" w:sz="4"/>
-              <w:right w:val="single" w:color="A6A6A6" w:sz="4"/>
-            </w:tcBorders>
-            <w:tcMar>
-              <w:top w:type="dxa" w:w="30"/>
-              <w:left w:type="dxa" w:w="90"/>
-              <w:bottom w:type="dxa" w:w="30"/>
-              <w:right w:type="dxa" w:w="90"/>
-            </w:tcMar>
-            <w:vAlign w:val="center"/>
-          </w:tcPr>
-          <w:p>
-            <w:pPr>
-              <w:spacing w:after="0" w:line="250"/>
-            </w:pPr>
-            <w:r>
-              <w:rPr>
-                <w:rFonts w:ascii="Arial" w:cs="Arial" w:eastAsia="Arial" w:hAnsi="Arial"/>
-                <w:b/>
-                <w:bCs/>
-                <w:sz w:val="18"/>
-                <w:szCs w:val="18"/>
-              </w:rPr>
-              <w:t xml:space="preserve">Desempenho</w:t>
-            </w:r>
-          </w:p>
-        </w:tc>
-        <w:tc>
-          <w:tcPr>
-            <w:tcW w:type="dxa" w:w="700"/>
-            <w:tcBorders>
-              <w:top w:val="single" w:color="A6A6A6" w:sz="4"/>
-              <w:left w:val="single" w:color="A6A6A6" w:sz="4"/>
-              <w:bottom w:val="single" w:color="A6A6A6" w:sz="4"/>
-              <w:right w:val="single" w:color="A6A6A6" w:sz="4"/>
-            </w:tcBorders>
-            <w:tcMar>
-              <w:top w:type="dxa" w:w="30"/>
-              <w:left w:type="dxa" w:w="90"/>
-              <w:bottom w:type="dxa" w:w="30"/>
-              <w:right w:type="dxa" w:w="90"/>
-            </w:tcMar>
-            <w:vAlign w:val="center"/>
-          </w:tcPr>
-          <w:p>
-            <w:pPr>
-              <w:spacing w:after="0" w:line="250"/>
-              <w:jc w:val="center"/>
-            </w:pPr>
-            <w:r>
-              <w:rPr>
-                <w:rFonts w:ascii="Arial" w:cs="Arial" w:eastAsia="Arial" w:hAnsi="Arial"/>
-                <w:b/>
-                <w:bCs/>
-                <w:sz w:val="18"/>
-                <w:szCs w:val="18"/>
-              </w:rPr>
-              <w:t xml:space="preserve">3</w:t>
-            </w:r>
-          </w:p>
-        </w:tc>
-        <w:tc>
-          <w:tcPr>
-            <w:tcW w:type="dxa" w:w="5938"/>
-            <w:tcBorders>
-              <w:top w:val="single" w:color="A6A6A6" w:sz="4"/>
-              <w:left w:val="single" w:color="A6A6A6" w:sz="4"/>
-              <w:bottom w:val="single" w:color="A6A6A6" w:sz="4"/>
-              <w:right w:val="single" w:color="A6A6A6" w:sz="4"/>
-            </w:tcBorders>
-            <w:tcMar>
-              <w:top w:type="dxa" w:w="30"/>
-              <w:left w:type="dxa" w:w="90"/>
-              <w:bottom w:type="dxa" w:w="30"/>
-              <w:right w:type="dxa" w:w="90"/>
-            </w:tcMar>
-            <w:vAlign w:val="center"/>
-          </w:tcPr>
-          <w:p>
-            <w:pPr>
-              <w:spacing w:after="0" w:line="250"/>
-            </w:pPr>
-            <w:r>
-              <w:rPr>
-                <w:rFonts w:ascii="Arial" w:cs="Arial" w:eastAsia="Arial" w:hAnsi="Arial"/>
-                <w:sz w:val="16"/>
-                <w:szCs w:val="16"/>
-              </w:rPr>
-              <w:t xml:space="preserve">O tempo de resposta importa no fluxo de pagamento, pois o cliente espera o QR Code e a confirmação, mas não há exigência contratual de tempo nem processamento crítico em tempo real.</w:t>
-            </w:r>
-          </w:p>
-        </w:tc>
-      </w:tr>
-      <w:tr>
-        <w:trPr>
-          <w:cantSplit/>
-        </w:trPr>
-        <w:tc>
-          <w:tcPr>
-            <w:tcW w:type="dxa" w:w="500"/>
-            <w:tcBorders>
-              <w:top w:val="single" w:color="A6A6A6" w:sz="4"/>
-              <w:left w:val="single" w:color="A6A6A6" w:sz="4"/>
-              <w:bottom w:val="single" w:color="A6A6A6" w:sz="4"/>
-              <w:right w:val="single" w:color="A6A6A6" w:sz="4"/>
-            </w:tcBorders>
-            <w:tcMar>
-              <w:top w:type="dxa" w:w="45"/>
-              <w:left w:type="dxa" w:w="90"/>
-              <w:bottom w:type="dxa" w:w="45"/>
-              <w:right w:type="dxa" w:w="90"/>
-            </w:tcMar>
-            <w:vAlign w:val="center"/>
-          </w:tcPr>
-          <w:p>
-            <w:pPr>
-              <w:spacing w:after="0" w:line="250"/>
-              <w:jc w:val="center"/>
-            </w:pPr>
-            <w:r>
-              <w:rPr>
-                <w:rFonts w:ascii="Arial" w:cs="Arial" w:eastAsia="Arial" w:hAnsi="Arial"/>
-                <w:sz w:val="18"/>
-                <w:szCs w:val="18"/>
-              </w:rPr>
-              <w:t xml:space="preserve">4</w:t>
-            </w:r>
-          </w:p>
-        </w:tc>
-        <w:tc>
-          <w:tcPr>
-            <w:tcW w:type="dxa" w:w="2500"/>
-            <w:tcBorders>
-              <w:top w:val="single" w:color="A6A6A6" w:sz="4"/>
-              <w:left w:val="single" w:color="A6A6A6" w:sz="4"/>
-              <w:bottom w:val="single" w:color="A6A6A6" w:sz="4"/>
-              <w:right w:val="single" w:color="A6A6A6" w:sz="4"/>
-            </w:tcBorders>
-            <w:tcMar>
-              <w:top w:type="dxa" w:w="30"/>
-              <w:left w:type="dxa" w:w="90"/>
-              <w:bottom w:type="dxa" w:w="30"/>
-              <w:right w:type="dxa" w:w="90"/>
-            </w:tcMar>
-            <w:vAlign w:val="center"/>
-          </w:tcPr>
-          <w:p>
-            <w:pPr>
-              <w:spacing w:after="0" w:line="250"/>
-            </w:pPr>
-            <w:r>
-              <w:rPr>
-                <w:rFonts w:ascii="Arial" w:cs="Arial" w:eastAsia="Arial" w:hAnsi="Arial"/>
-                <w:b/>
-                <w:bCs/>
-                <w:sz w:val="18"/>
-                <w:szCs w:val="18"/>
-              </w:rPr>
-              <w:t xml:space="preserve">Configuração do equipamento muito utilizada</w:t>
-            </w:r>
-          </w:p>
-        </w:tc>
-        <w:tc>
-          <w:tcPr>
-            <w:tcW w:type="dxa" w:w="700"/>
-            <w:tcBorders>
-              <w:top w:val="single" w:color="A6A6A6" w:sz="4"/>
-              <w:left w:val="single" w:color="A6A6A6" w:sz="4"/>
-              <w:bottom w:val="single" w:color="A6A6A6" w:sz="4"/>
-              <w:right w:val="single" w:color="A6A6A6" w:sz="4"/>
-            </w:tcBorders>
-            <w:tcMar>
-              <w:top w:type="dxa" w:w="30"/>
-              <w:left w:type="dxa" w:w="90"/>
-              <w:bottom w:type="dxa" w:w="30"/>
-              <w:right w:type="dxa" w:w="90"/>
-            </w:tcMar>
-            <w:vAlign w:val="center"/>
-          </w:tcPr>
-          <w:p>
-            <w:pPr>
-              <w:spacing w:after="0" w:line="250"/>
-              <w:jc w:val="center"/>
-            </w:pPr>
-            <w:r>
-              <w:rPr>
-                <w:rFonts w:ascii="Arial" w:cs="Arial" w:eastAsia="Arial" w:hAnsi="Arial"/>
-                <w:b/>
-                <w:bCs/>
-                <w:sz w:val="18"/>
-                <w:szCs w:val="18"/>
-              </w:rPr>
-              <w:t xml:space="preserve">2</w:t>
-            </w:r>
-          </w:p>
-        </w:tc>
-        <w:tc>
-          <w:tcPr>
-            <w:tcW w:type="dxa" w:w="5938"/>
-            <w:tcBorders>
-              <w:top w:val="single" w:color="A6A6A6" w:sz="4"/>
-              <w:left w:val="single" w:color="A6A6A6" w:sz="4"/>
-              <w:bottom w:val="single" w:color="A6A6A6" w:sz="4"/>
-              <w:right w:val="single" w:color="A6A6A6" w:sz="4"/>
-            </w:tcBorders>
-            <w:tcMar>
-              <w:top w:type="dxa" w:w="30"/>
-              <w:left w:type="dxa" w:w="90"/>
-              <w:bottom w:type="dxa" w:w="30"/>
-              <w:right w:type="dxa" w:w="90"/>
-            </w:tcMar>
-            <w:vAlign w:val="center"/>
-          </w:tcPr>
-          <w:p>
-            <w:pPr>
-              <w:spacing w:after="0" w:line="250"/>
-            </w:pPr>
-            <w:r>
-              <w:rPr>
-                <w:rFonts w:ascii="Arial" w:cs="Arial" w:eastAsia="Arial" w:hAnsi="Arial"/>
-                <w:sz w:val="16"/>
-                <w:szCs w:val="16"/>
-              </w:rPr>
-              <w:t xml:space="preserve">O MultiPag roda em recursos padrão de nuvem, sem restrição de hardware ou de operação que obrigue um cuidado especial com a configuração.</w:t>
-            </w:r>
-          </w:p>
-        </w:tc>
-      </w:tr>
-      <w:tr>
-        <w:trPr>
-          <w:cantSplit/>
-        </w:trPr>
-        <w:tc>
-          <w:tcPr>
-            <w:tcW w:type="dxa" w:w="500"/>
-            <w:tcBorders>
-              <w:top w:val="single" w:color="A6A6A6" w:sz="4"/>
-              <w:left w:val="single" w:color="A6A6A6" w:sz="4"/>
-              <w:bottom w:val="single" w:color="A6A6A6" w:sz="4"/>
-              <w:right w:val="single" w:color="A6A6A6" w:sz="4"/>
-            </w:tcBorders>
-            <w:tcMar>
-              <w:top w:type="dxa" w:w="45"/>
-              <w:left w:type="dxa" w:w="90"/>
-              <w:bottom w:type="dxa" w:w="45"/>
-              <w:right w:type="dxa" w:w="90"/>
-            </w:tcMar>
-            <w:vAlign w:val="center"/>
-          </w:tcPr>
-          <w:p>
-            <w:pPr>
-              <w:spacing w:after="0" w:line="250"/>
-              <w:jc w:val="center"/>
-            </w:pPr>
-            <w:r>
-              <w:rPr>
-                <w:rFonts w:ascii="Arial" w:cs="Arial" w:eastAsia="Arial" w:hAnsi="Arial"/>
-                <w:sz w:val="18"/>
-                <w:szCs w:val="18"/>
-              </w:rPr>
-              <w:t xml:space="preserve">5</w:t>
-            </w:r>
-          </w:p>
-        </w:tc>
-        <w:tc>
-          <w:tcPr>
-            <w:tcW w:type="dxa" w:w="2500"/>
-            <w:tcBorders>
-              <w:top w:val="single" w:color="A6A6A6" w:sz="4"/>
-              <w:left w:val="single" w:color="A6A6A6" w:sz="4"/>
-              <w:bottom w:val="single" w:color="A6A6A6" w:sz="4"/>
-              <w:right w:val="single" w:color="A6A6A6" w:sz="4"/>
-            </w:tcBorders>
-            <w:tcMar>
-              <w:top w:type="dxa" w:w="30"/>
-              <w:left w:type="dxa" w:w="90"/>
-              <w:bottom w:type="dxa" w:w="30"/>
-              <w:right w:type="dxa" w:w="90"/>
-            </w:tcMar>
-            <w:vAlign w:val="center"/>
-          </w:tcPr>
-          <w:p>
-            <w:pPr>
-              <w:spacing w:after="0" w:line="250"/>
-            </w:pPr>
-            <w:r>
-              <w:rPr>
-                <w:rFonts w:ascii="Arial" w:cs="Arial" w:eastAsia="Arial" w:hAnsi="Arial"/>
-                <w:b/>
-                <w:bCs/>
-                <w:sz w:val="18"/>
-                <w:szCs w:val="18"/>
-              </w:rPr>
-              <w:t xml:space="preserve">Volume de transações</w:t>
-            </w:r>
-          </w:p>
-        </w:tc>
-        <w:tc>
-          <w:tcPr>
-            <w:tcW w:type="dxa" w:w="700"/>
-            <w:tcBorders>
-              <w:top w:val="single" w:color="A6A6A6" w:sz="4"/>
-              <w:left w:val="single" w:color="A6A6A6" w:sz="4"/>
-              <w:bottom w:val="single" w:color="A6A6A6" w:sz="4"/>
-              <w:right w:val="single" w:color="A6A6A6" w:sz="4"/>
-            </w:tcBorders>
-            <w:tcMar>
-              <w:top w:type="dxa" w:w="30"/>
-              <w:left w:type="dxa" w:w="90"/>
-              <w:bottom w:type="dxa" w:w="30"/>
-              <w:right w:type="dxa" w:w="90"/>
-            </w:tcMar>
-            <w:vAlign w:val="center"/>
-          </w:tcPr>
-          <w:p>
-            <w:pPr>
-              <w:spacing w:after="0" w:line="250"/>
-              <w:jc w:val="center"/>
-            </w:pPr>
-            <w:r>
-              <w:rPr>
-                <w:rFonts w:ascii="Arial" w:cs="Arial" w:eastAsia="Arial" w:hAnsi="Arial"/>
-                <w:b/>
-                <w:bCs/>
-                <w:sz w:val="18"/>
-                <w:szCs w:val="18"/>
-              </w:rPr>
-              <w:t xml:space="preserve">3</w:t>
-            </w:r>
-          </w:p>
-        </w:tc>
-        <w:tc>
-          <w:tcPr>
-            <w:tcW w:type="dxa" w:w="5938"/>
-            <w:tcBorders>
-              <w:top w:val="single" w:color="A6A6A6" w:sz="4"/>
-              <w:left w:val="single" w:color="A6A6A6" w:sz="4"/>
-              <w:bottom w:val="single" w:color="A6A6A6" w:sz="4"/>
-              <w:right w:val="single" w:color="A6A6A6" w:sz="4"/>
-            </w:tcBorders>
-            <w:tcMar>
-              <w:top w:type="dxa" w:w="30"/>
-              <w:left w:type="dxa" w:w="90"/>
-              <w:bottom w:type="dxa" w:w="30"/>
-              <w:right w:type="dxa" w:w="90"/>
-            </w:tcMar>
-            <w:vAlign w:val="center"/>
-          </w:tcPr>
-          <w:p>
-            <w:pPr>
-              <w:spacing w:after="0" w:line="250"/>
-            </w:pPr>
-            <w:r>
-              <w:rPr>
-                <w:rFonts w:ascii="Arial" w:cs="Arial" w:eastAsia="Arial" w:hAnsi="Arial"/>
-                <w:sz w:val="16"/>
-                <w:szCs w:val="16"/>
-              </w:rPr>
-              <w:t xml:space="preserve">Vários businesses emitem cobranças e vários clientes pagam ao mesmo tempo, com picos no início do mês por causa das cobranças recorrentes, mas sem um pico crítico fixo.</w:t>
-            </w:r>
-          </w:p>
-        </w:tc>
-      </w:tr>
-      <w:tr>
-        <w:trPr>
-          <w:cantSplit/>
-        </w:trPr>
-        <w:tc>
-          <w:tcPr>
-            <w:tcW w:type="dxa" w:w="500"/>
-            <w:tcBorders>
-              <w:top w:val="single" w:color="A6A6A6" w:sz="4"/>
-              <w:left w:val="single" w:color="A6A6A6" w:sz="4"/>
-              <w:bottom w:val="single" w:color="A6A6A6" w:sz="4"/>
-              <w:right w:val="single" w:color="A6A6A6" w:sz="4"/>
-            </w:tcBorders>
-            <w:tcMar>
-              <w:top w:type="dxa" w:w="45"/>
-              <w:left w:type="dxa" w:w="90"/>
-              <w:bottom w:type="dxa" w:w="45"/>
-              <w:right w:type="dxa" w:w="90"/>
-            </w:tcMar>
-            <w:vAlign w:val="center"/>
-          </w:tcPr>
-          <w:p>
-            <w:pPr>
-              <w:spacing w:after="0" w:line="250"/>
-              <w:jc w:val="center"/>
-            </w:pPr>
-            <w:r>
-              <w:rPr>
-                <w:rFonts w:ascii="Arial" w:cs="Arial" w:eastAsia="Arial" w:hAnsi="Arial"/>
-                <w:sz w:val="18"/>
-                <w:szCs w:val="18"/>
-              </w:rPr>
-              <w:t xml:space="preserve">6</w:t>
-            </w:r>
-          </w:p>
-        </w:tc>
-        <w:tc>
-          <w:tcPr>
-            <w:tcW w:type="dxa" w:w="2500"/>
-            <w:tcBorders>
-              <w:top w:val="single" w:color="A6A6A6" w:sz="4"/>
-              <w:left w:val="single" w:color="A6A6A6" w:sz="4"/>
-              <w:bottom w:val="single" w:color="A6A6A6" w:sz="4"/>
-              <w:right w:val="single" w:color="A6A6A6" w:sz="4"/>
-            </w:tcBorders>
-            <w:tcMar>
-              <w:top w:type="dxa" w:w="30"/>
-              <w:left w:type="dxa" w:w="90"/>
-              <w:bottom w:type="dxa" w:w="30"/>
-              <w:right w:type="dxa" w:w="90"/>
-            </w:tcMar>
-            <w:vAlign w:val="center"/>
-          </w:tcPr>
-          <w:p>
-            <w:pPr>
-              <w:spacing w:after="0" w:line="250"/>
-            </w:pPr>
-            <w:r>
-              <w:rPr>
-                <w:rFonts w:ascii="Arial" w:cs="Arial" w:eastAsia="Arial" w:hAnsi="Arial"/>
-                <w:b/>
-                <w:bCs/>
-                <w:sz w:val="18"/>
-                <w:szCs w:val="18"/>
-              </w:rPr>
-              <w:t xml:space="preserve">Entrada de dados on-line</w:t>
-            </w:r>
-          </w:p>
-        </w:tc>
-        <w:tc>
-          <w:tcPr>
-            <w:tcW w:type="dxa" w:w="700"/>
-            <w:tcBorders>
-              <w:top w:val="single" w:color="A6A6A6" w:sz="4"/>
-              <w:left w:val="single" w:color="A6A6A6" w:sz="4"/>
-              <w:bottom w:val="single" w:color="A6A6A6" w:sz="4"/>
-              <w:right w:val="single" w:color="A6A6A6" w:sz="4"/>
-            </w:tcBorders>
-            <w:tcMar>
-              <w:top w:type="dxa" w:w="30"/>
-              <w:left w:type="dxa" w:w="90"/>
-              <w:bottom w:type="dxa" w:w="30"/>
-              <w:right w:type="dxa" w:w="90"/>
-            </w:tcMar>
-            <w:vAlign w:val="center"/>
-          </w:tcPr>
-          <w:p>
-            <w:pPr>
-              <w:spacing w:after="0" w:line="250"/>
-              <w:jc w:val="center"/>
-            </w:pPr>
-            <w:r>
-              <w:rPr>
-                <w:rFonts w:ascii="Arial" w:cs="Arial" w:eastAsia="Arial" w:hAnsi="Arial"/>
-                <w:b/>
-                <w:bCs/>
-                <w:sz w:val="18"/>
-                <w:szCs w:val="18"/>
-              </w:rPr>
-              <w:t xml:space="preserve">5</w:t>
-            </w:r>
-          </w:p>
-        </w:tc>
-        <w:tc>
-          <w:tcPr>
-            <w:tcW w:type="dxa" w:w="5938"/>
-            <w:tcBorders>
-              <w:top w:val="single" w:color="A6A6A6" w:sz="4"/>
-              <w:left w:val="single" w:color="A6A6A6" w:sz="4"/>
-              <w:bottom w:val="single" w:color="A6A6A6" w:sz="4"/>
-              <w:right w:val="single" w:color="A6A6A6" w:sz="4"/>
-            </w:tcBorders>
-            <w:tcMar>
-              <w:top w:type="dxa" w:w="30"/>
-              <w:left w:type="dxa" w:w="90"/>
-              <w:bottom w:type="dxa" w:w="30"/>
-              <w:right w:type="dxa" w:w="90"/>
-            </w:tcMar>
-            <w:vAlign w:val="center"/>
-          </w:tcPr>
-          <w:p>
-            <w:pPr>
-              <w:spacing w:after="0" w:line="250"/>
-            </w:pPr>
-            <w:r>
-              <w:rPr>
-                <w:rFonts w:ascii="Arial" w:cs="Arial" w:eastAsia="Arial" w:hAnsi="Arial"/>
-                <w:sz w:val="16"/>
-                <w:szCs w:val="16"/>
-              </w:rPr>
-              <w:t xml:space="preserve">Todas as entradas são feitas on-line, por formulários (cadastro, cobrança, pagamento, saque) e por retornos automáticos dos gateways. Não existe processamento em lote.</w:t>
-            </w:r>
-          </w:p>
-        </w:tc>
-      </w:tr>
-      <w:tr>
-        <w:trPr>
-          <w:cantSplit/>
-        </w:trPr>
-        <w:tc>
-          <w:tcPr>
-            <w:tcW w:type="dxa" w:w="500"/>
-            <w:tcBorders>
-              <w:top w:val="single" w:color="A6A6A6" w:sz="4"/>
-              <w:left w:val="single" w:color="A6A6A6" w:sz="4"/>
-              <w:bottom w:val="single" w:color="A6A6A6" w:sz="4"/>
-              <w:right w:val="single" w:color="A6A6A6" w:sz="4"/>
-            </w:tcBorders>
-            <w:tcMar>
-              <w:top w:type="dxa" w:w="45"/>
-              <w:left w:type="dxa" w:w="90"/>
-              <w:bottom w:type="dxa" w:w="45"/>
-              <w:right w:type="dxa" w:w="90"/>
-            </w:tcMar>
-            <w:vAlign w:val="center"/>
-          </w:tcPr>
-          <w:p>
-            <w:pPr>
-              <w:spacing w:after="0" w:line="250"/>
-              <w:jc w:val="center"/>
-            </w:pPr>
-            <w:r>
-              <w:rPr>
-                <w:rFonts w:ascii="Arial" w:cs="Arial" w:eastAsia="Arial" w:hAnsi="Arial"/>
-                <w:sz w:val="18"/>
-                <w:szCs w:val="18"/>
-              </w:rPr>
-              <w:t xml:space="preserve">7</w:t>
-            </w:r>
-          </w:p>
-        </w:tc>
-        <w:tc>
-          <w:tcPr>
-            <w:tcW w:type="dxa" w:w="2500"/>
-            <w:tcBorders>
-              <w:top w:val="single" w:color="A6A6A6" w:sz="4"/>
-              <w:left w:val="single" w:color="A6A6A6" w:sz="4"/>
-              <w:bottom w:val="single" w:color="A6A6A6" w:sz="4"/>
-              <w:right w:val="single" w:color="A6A6A6" w:sz="4"/>
-            </w:tcBorders>
-            <w:tcMar>
-              <w:top w:type="dxa" w:w="30"/>
-              <w:left w:type="dxa" w:w="90"/>
-              <w:bottom w:type="dxa" w:w="30"/>
-              <w:right w:type="dxa" w:w="90"/>
-            </w:tcMar>
-            <w:vAlign w:val="center"/>
-          </w:tcPr>
-          <w:p>
-            <w:pPr>
-              <w:spacing w:after="0" w:line="250"/>
-            </w:pPr>
-            <w:r>
-              <w:rPr>
-                <w:rFonts w:ascii="Arial" w:cs="Arial" w:eastAsia="Arial" w:hAnsi="Arial"/>
-                <w:b/>
-                <w:bCs/>
-                <w:sz w:val="18"/>
-                <w:szCs w:val="18"/>
-              </w:rPr>
-              <w:t xml:space="preserve">Eficiência do usuário final</w:t>
-            </w:r>
-          </w:p>
-        </w:tc>
-        <w:tc>
-          <w:tcPr>
-            <w:tcW w:type="dxa" w:w="700"/>
-            <w:tcBorders>
-              <w:top w:val="single" w:color="A6A6A6" w:sz="4"/>
-              <w:left w:val="single" w:color="A6A6A6" w:sz="4"/>
-              <w:bottom w:val="single" w:color="A6A6A6" w:sz="4"/>
-              <w:right w:val="single" w:color="A6A6A6" w:sz="4"/>
-            </w:tcBorders>
-            <w:tcMar>
-              <w:top w:type="dxa" w:w="30"/>
-              <w:left w:type="dxa" w:w="90"/>
-              <w:bottom w:type="dxa" w:w="30"/>
-              <w:right w:type="dxa" w:w="90"/>
-            </w:tcMar>
-            <w:vAlign w:val="center"/>
-          </w:tcPr>
-          <w:p>
-            <w:pPr>
-              <w:spacing w:after="0" w:line="250"/>
-              <w:jc w:val="center"/>
-            </w:pPr>
-            <w:r>
-              <w:rPr>
-                <w:rFonts w:ascii="Arial" w:cs="Arial" w:eastAsia="Arial" w:hAnsi="Arial"/>
-                <w:b/>
-                <w:bCs/>
-                <w:sz w:val="18"/>
-                <w:szCs w:val="18"/>
-              </w:rPr>
-              <w:t xml:space="preserve">4</w:t>
-            </w:r>
-          </w:p>
-        </w:tc>
-        <w:tc>
-          <w:tcPr>
-            <w:tcW w:type="dxa" w:w="5938"/>
-            <w:tcBorders>
-              <w:top w:val="single" w:color="A6A6A6" w:sz="4"/>
-              <w:left w:val="single" w:color="A6A6A6" w:sz="4"/>
-              <w:bottom w:val="single" w:color="A6A6A6" w:sz="4"/>
-              <w:right w:val="single" w:color="A6A6A6" w:sz="4"/>
-            </w:tcBorders>
-            <w:tcMar>
-              <w:top w:type="dxa" w:w="30"/>
-              <w:left w:type="dxa" w:w="90"/>
-              <w:bottom w:type="dxa" w:w="30"/>
-              <w:right w:type="dxa" w:w="90"/>
-            </w:tcMar>
-            <w:vAlign w:val="center"/>
-          </w:tcPr>
-          <w:p>
-            <w:pPr>
-              <w:spacing w:after="0" w:line="250"/>
-            </w:pPr>
-            <w:r>
-              <w:rPr>
-                <w:rFonts w:ascii="Arial" w:cs="Arial" w:eastAsia="Arial" w:hAnsi="Arial"/>
-                <w:sz w:val="16"/>
-                <w:szCs w:val="16"/>
-              </w:rPr>
-              <w:t xml:space="preserve">Os fluxos são guiados em etapas, com validação na hora (CPF verificado, chave Pix encontrada), botão de copiar código, QR Code e totais já calculados, para reduzir o esforço do usuário.</w:t>
-            </w:r>
-          </w:p>
-        </w:tc>
-      </w:tr>
-      <w:tr>
-        <w:trPr>
-          <w:cantSplit/>
-        </w:trPr>
-        <w:tc>
-          <w:tcPr>
-            <w:tcW w:type="dxa" w:w="500"/>
-            <w:tcBorders>
-              <w:top w:val="single" w:color="A6A6A6" w:sz="4"/>
-              <w:left w:val="single" w:color="A6A6A6" w:sz="4"/>
-              <w:bottom w:val="single" w:color="A6A6A6" w:sz="4"/>
-              <w:right w:val="single" w:color="A6A6A6" w:sz="4"/>
-            </w:tcBorders>
-            <w:tcMar>
-              <w:top w:type="dxa" w:w="45"/>
-              <w:left w:type="dxa" w:w="90"/>
-              <w:bottom w:type="dxa" w:w="45"/>
-              <w:right w:type="dxa" w:w="90"/>
-            </w:tcMar>
-            <w:vAlign w:val="center"/>
-          </w:tcPr>
-          <w:p>
-            <w:pPr>
-              <w:spacing w:after="0" w:line="250"/>
-              <w:jc w:val="center"/>
-            </w:pPr>
-            <w:r>
-              <w:rPr>
-                <w:rFonts w:ascii="Arial" w:cs="Arial" w:eastAsia="Arial" w:hAnsi="Arial"/>
-                <w:sz w:val="18"/>
-                <w:szCs w:val="18"/>
-              </w:rPr>
-              <w:t xml:space="preserve">8</w:t>
-            </w:r>
-          </w:p>
-        </w:tc>
-        <w:tc>
-          <w:tcPr>
-            <w:tcW w:type="dxa" w:w="2500"/>
-            <w:tcBorders>
-              <w:top w:val="single" w:color="A6A6A6" w:sz="4"/>
-              <w:left w:val="single" w:color="A6A6A6" w:sz="4"/>
-              <w:bottom w:val="single" w:color="A6A6A6" w:sz="4"/>
-              <w:right w:val="single" w:color="A6A6A6" w:sz="4"/>
-            </w:tcBorders>
-            <w:tcMar>
-              <w:top w:type="dxa" w:w="30"/>
-              <w:left w:type="dxa" w:w="90"/>
-              <w:bottom w:type="dxa" w:w="30"/>
-              <w:right w:type="dxa" w:w="90"/>
-            </w:tcMar>
-            <w:vAlign w:val="center"/>
-          </w:tcPr>
-          <w:p>
-            <w:pPr>
-              <w:spacing w:after="0" w:line="250"/>
-            </w:pPr>
-            <w:r>
-              <w:rPr>
-                <w:rFonts w:ascii="Arial" w:cs="Arial" w:eastAsia="Arial" w:hAnsi="Arial"/>
-                <w:b/>
-                <w:bCs/>
-                <w:sz w:val="18"/>
-                <w:szCs w:val="18"/>
-              </w:rPr>
-              <w:t xml:space="preserve">Atualização on-line</w:t>
-            </w:r>
-          </w:p>
-        </w:tc>
-        <w:tc>
-          <w:tcPr>
-            <w:tcW w:type="dxa" w:w="700"/>
-            <w:tcBorders>
-              <w:top w:val="single" w:color="A6A6A6" w:sz="4"/>
-              <w:left w:val="single" w:color="A6A6A6" w:sz="4"/>
-              <w:bottom w:val="single" w:color="A6A6A6" w:sz="4"/>
-              <w:right w:val="single" w:color="A6A6A6" w:sz="4"/>
-            </w:tcBorders>
-            <w:tcMar>
-              <w:top w:type="dxa" w:w="30"/>
-              <w:left w:type="dxa" w:w="90"/>
-              <w:bottom w:type="dxa" w:w="30"/>
-              <w:right w:type="dxa" w:w="90"/>
-            </w:tcMar>
-            <w:vAlign w:val="center"/>
-          </w:tcPr>
-          <w:p>
-            <w:pPr>
-              <w:spacing w:after="0" w:line="250"/>
-              <w:jc w:val="center"/>
-            </w:pPr>
-            <w:r>
-              <w:rPr>
-                <w:rFonts w:ascii="Arial" w:cs="Arial" w:eastAsia="Arial" w:hAnsi="Arial"/>
-                <w:b/>
-                <w:bCs/>
-                <w:sz w:val="18"/>
-                <w:szCs w:val="18"/>
-              </w:rPr>
-              <w:t xml:space="preserve">4</w:t>
-            </w:r>
-          </w:p>
-        </w:tc>
-        <w:tc>
-          <w:tcPr>
-            <w:tcW w:type="dxa" w:w="5938"/>
-            <w:tcBorders>
-              <w:top w:val="single" w:color="A6A6A6" w:sz="4"/>
-              <w:left w:val="single" w:color="A6A6A6" w:sz="4"/>
-              <w:bottom w:val="single" w:color="A6A6A6" w:sz="4"/>
-              <w:right w:val="single" w:color="A6A6A6" w:sz="4"/>
-            </w:tcBorders>
-            <w:tcMar>
-              <w:top w:type="dxa" w:w="30"/>
-              <w:left w:type="dxa" w:w="90"/>
-              <w:bottom w:type="dxa" w:w="30"/>
-              <w:right w:type="dxa" w:w="90"/>
-            </w:tcMar>
-            <w:vAlign w:val="center"/>
-          </w:tcPr>
-          <w:p>
-            <w:pPr>
-              <w:spacing w:after="0" w:line="250"/>
-            </w:pPr>
-            <w:r>
-              <w:rPr>
-                <w:rFonts w:ascii="Arial" w:cs="Arial" w:eastAsia="Arial" w:hAnsi="Arial"/>
-                <w:sz w:val="16"/>
-                <w:szCs w:val="16"/>
-              </w:rPr>
-              <w:t xml:space="preserve">Cobrança, pagamento, saldo, extrato e saque são atualizados on-line a cada operação, com recuperação pelo status. Não há duplicação de dados em tempo real nem recuperação automática completa, por isso a nota não é 5.</w:t>
-            </w:r>
-          </w:p>
-        </w:tc>
-      </w:tr>
-      <w:tr>
-        <w:trPr>
-          <w:cantSplit/>
-        </w:trPr>
-        <w:tc>
-          <w:tcPr>
-            <w:tcW w:type="dxa" w:w="500"/>
-            <w:tcBorders>
-              <w:top w:val="single" w:color="A6A6A6" w:sz="4"/>
-              <w:left w:val="single" w:color="A6A6A6" w:sz="4"/>
-              <w:bottom w:val="single" w:color="A6A6A6" w:sz="4"/>
-              <w:right w:val="single" w:color="A6A6A6" w:sz="4"/>
-            </w:tcBorders>
-            <w:tcMar>
-              <w:top w:type="dxa" w:w="45"/>
-              <w:left w:type="dxa" w:w="90"/>
-              <w:bottom w:type="dxa" w:w="45"/>
-              <w:right w:type="dxa" w:w="90"/>
-            </w:tcMar>
-            <w:vAlign w:val="center"/>
-          </w:tcPr>
-          <w:p>
-            <w:pPr>
-              <w:spacing w:after="0" w:line="250"/>
-              <w:jc w:val="center"/>
-            </w:pPr>
-            <w:r>
-              <w:rPr>
-                <w:rFonts w:ascii="Arial" w:cs="Arial" w:eastAsia="Arial" w:hAnsi="Arial"/>
-                <w:sz w:val="18"/>
-                <w:szCs w:val="18"/>
-              </w:rPr>
-              <w:t xml:space="preserve">9</w:t>
-            </w:r>
-          </w:p>
-        </w:tc>
-        <w:tc>
-          <w:tcPr>
-            <w:tcW w:type="dxa" w:w="2500"/>
-            <w:tcBorders>
-              <w:top w:val="single" w:color="A6A6A6" w:sz="4"/>
-              <w:left w:val="single" w:color="A6A6A6" w:sz="4"/>
-              <w:bottom w:val="single" w:color="A6A6A6" w:sz="4"/>
-              <w:right w:val="single" w:color="A6A6A6" w:sz="4"/>
-            </w:tcBorders>
-            <w:tcMar>
-              <w:top w:type="dxa" w:w="30"/>
-              <w:left w:type="dxa" w:w="90"/>
-              <w:bottom w:type="dxa" w:w="30"/>
-              <w:right w:type="dxa" w:w="90"/>
-            </w:tcMar>
-            <w:vAlign w:val="center"/>
-          </w:tcPr>
-          <w:p>
-            <w:pPr>
-              <w:spacing w:after="0" w:line="250"/>
-            </w:pPr>
-            <w:r>
-              <w:rPr>
-                <w:rFonts w:ascii="Arial" w:cs="Arial" w:eastAsia="Arial" w:hAnsi="Arial"/>
-                <w:b/>
-                <w:bCs/>
-                <w:sz w:val="18"/>
-                <w:szCs w:val="18"/>
-              </w:rPr>
-              <w:t xml:space="preserve">Processamento complexo</w:t>
-            </w:r>
-          </w:p>
-        </w:tc>
-        <w:tc>
-          <w:tcPr>
-            <w:tcW w:type="dxa" w:w="700"/>
-            <w:tcBorders>
-              <w:top w:val="single" w:color="A6A6A6" w:sz="4"/>
-              <w:left w:val="single" w:color="A6A6A6" w:sz="4"/>
-              <w:bottom w:val="single" w:color="A6A6A6" w:sz="4"/>
-              <w:right w:val="single" w:color="A6A6A6" w:sz="4"/>
-            </w:tcBorders>
-            <w:tcMar>
-              <w:top w:type="dxa" w:w="30"/>
-              <w:left w:type="dxa" w:w="90"/>
-              <w:bottom w:type="dxa" w:w="30"/>
-              <w:right w:type="dxa" w:w="90"/>
-            </w:tcMar>
-            <w:vAlign w:val="center"/>
-          </w:tcPr>
-          <w:p>
-            <w:pPr>
-              <w:spacing w:after="0" w:line="250"/>
-              <w:jc w:val="center"/>
-            </w:pPr>
-            <w:r>
-              <w:rPr>
-                <w:rFonts w:ascii="Arial" w:cs="Arial" w:eastAsia="Arial" w:hAnsi="Arial"/>
-                <w:b/>
-                <w:bCs/>
-                <w:sz w:val="18"/>
-                <w:szCs w:val="18"/>
-              </w:rPr>
-              <w:t xml:space="preserve">3</w:t>
-            </w:r>
-          </w:p>
-        </w:tc>
-        <w:tc>
-          <w:tcPr>
-            <w:tcW w:type="dxa" w:w="5938"/>
-            <w:tcBorders>
-              <w:top w:val="single" w:color="A6A6A6" w:sz="4"/>
-              <w:left w:val="single" w:color="A6A6A6" w:sz="4"/>
-              <w:bottom w:val="single" w:color="A6A6A6" w:sz="4"/>
-              <w:right w:val="single" w:color="A6A6A6" w:sz="4"/>
-            </w:tcBorders>
-            <w:tcMar>
-              <w:top w:type="dxa" w:w="30"/>
-              <w:left w:type="dxa" w:w="90"/>
-              <w:bottom w:type="dxa" w:w="30"/>
-              <w:right w:type="dxa" w:w="90"/>
-            </w:tcMar>
-            <w:vAlign w:val="center"/>
-          </w:tcPr>
-          <w:p>
-            <w:pPr>
-              <w:spacing w:after="0" w:line="250"/>
-            </w:pPr>
-            <w:r>
-              <w:rPr>
-                <w:rFonts w:ascii="Arial" w:cs="Arial" w:eastAsia="Arial" w:hAnsi="Arial"/>
-                <w:sz w:val="16"/>
-                <w:szCs w:val="16"/>
-              </w:rPr>
-              <w:t xml:space="preserve">Há regras de negócio moderadas: controle de status da cobrança, validação de saldo, cálculo de cotação e de totais, autenticação e senha com hash. Não há algoritmos matemáticos complexos.</w:t>
-            </w:r>
-          </w:p>
-        </w:tc>
-      </w:tr>
-      <w:tr>
-        <w:trPr>
-          <w:cantSplit/>
-        </w:trPr>
-        <w:tc>
-          <w:tcPr>
-            <w:tcW w:type="dxa" w:w="500"/>
-            <w:tcBorders>
-              <w:top w:val="single" w:color="A6A6A6" w:sz="4"/>
-              <w:left w:val="single" w:color="A6A6A6" w:sz="4"/>
-              <w:bottom w:val="single" w:color="A6A6A6" w:sz="4"/>
-              <w:right w:val="single" w:color="A6A6A6" w:sz="4"/>
-            </w:tcBorders>
-            <w:tcMar>
-              <w:top w:type="dxa" w:w="45"/>
-              <w:left w:type="dxa" w:w="90"/>
-              <w:bottom w:type="dxa" w:w="45"/>
-              <w:right w:type="dxa" w:w="90"/>
-            </w:tcMar>
-            <w:vAlign w:val="center"/>
-          </w:tcPr>
-          <w:p>
-            <w:pPr>
-              <w:spacing w:after="0" w:line="250"/>
-              <w:jc w:val="center"/>
-            </w:pPr>
-            <w:r>
-              <w:rPr>
-                <w:rFonts w:ascii="Arial" w:cs="Arial" w:eastAsia="Arial" w:hAnsi="Arial"/>
-                <w:sz w:val="18"/>
-                <w:szCs w:val="18"/>
-              </w:rPr>
-              <w:t xml:space="preserve">10</w:t>
-            </w:r>
-          </w:p>
-        </w:tc>
-        <w:tc>
-          <w:tcPr>
-            <w:tcW w:type="dxa" w:w="2500"/>
-            <w:tcBorders>
-              <w:top w:val="single" w:color="A6A6A6" w:sz="4"/>
-              <w:left w:val="single" w:color="A6A6A6" w:sz="4"/>
-              <w:bottom w:val="single" w:color="A6A6A6" w:sz="4"/>
-              <w:right w:val="single" w:color="A6A6A6" w:sz="4"/>
-            </w:tcBorders>
-            <w:tcMar>
-              <w:top w:type="dxa" w:w="30"/>
-              <w:left w:type="dxa" w:w="90"/>
-              <w:bottom w:type="dxa" w:w="30"/>
-              <w:right w:type="dxa" w:w="90"/>
-            </w:tcMar>
-            <w:vAlign w:val="center"/>
-          </w:tcPr>
-          <w:p>
-            <w:pPr>
-              <w:spacing w:after="0" w:line="250"/>
-            </w:pPr>
-            <w:r>
-              <w:rPr>
-                <w:rFonts w:ascii="Arial" w:cs="Arial" w:eastAsia="Arial" w:hAnsi="Arial"/>
-                <w:b/>
-                <w:bCs/>
-                <w:sz w:val="18"/>
-                <w:szCs w:val="18"/>
-              </w:rPr>
-              <w:t xml:space="preserve">Reutilização de código</w:t>
-            </w:r>
-          </w:p>
-        </w:tc>
-        <w:tc>
-          <w:tcPr>
-            <w:tcW w:type="dxa" w:w="700"/>
-            <w:tcBorders>
-              <w:top w:val="single" w:color="A6A6A6" w:sz="4"/>
-              <w:left w:val="single" w:color="A6A6A6" w:sz="4"/>
-              <w:bottom w:val="single" w:color="A6A6A6" w:sz="4"/>
-              <w:right w:val="single" w:color="A6A6A6" w:sz="4"/>
-            </w:tcBorders>
-            <w:tcMar>
-              <w:top w:type="dxa" w:w="30"/>
-              <w:left w:type="dxa" w:w="90"/>
-              <w:bottom w:type="dxa" w:w="30"/>
-              <w:right w:type="dxa" w:w="90"/>
-            </w:tcMar>
-            <w:vAlign w:val="center"/>
-          </w:tcPr>
-          <w:p>
-            <w:pPr>
-              <w:spacing w:after="0" w:line="250"/>
-              <w:jc w:val="center"/>
-            </w:pPr>
-            <w:r>
-              <w:rPr>
-                <w:rFonts w:ascii="Arial" w:cs="Arial" w:eastAsia="Arial" w:hAnsi="Arial"/>
-                <w:b/>
-                <w:bCs/>
-                <w:sz w:val="18"/>
-                <w:szCs w:val="18"/>
-              </w:rPr>
-              <w:t xml:space="preserve">2</w:t>
-            </w:r>
-          </w:p>
-        </w:tc>
-        <w:tc>
-          <w:tcPr>
-            <w:tcW w:type="dxa" w:w="5938"/>
-            <w:tcBorders>
-              <w:top w:val="single" w:color="A6A6A6" w:sz="4"/>
-              <w:left w:val="single" w:color="A6A6A6" w:sz="4"/>
-              <w:bottom w:val="single" w:color="A6A6A6" w:sz="4"/>
-              <w:right w:val="single" w:color="A6A6A6" w:sz="4"/>
-            </w:tcBorders>
-            <w:tcMar>
-              <w:top w:type="dxa" w:w="30"/>
-              <w:left w:type="dxa" w:w="90"/>
-              <w:bottom w:type="dxa" w:w="30"/>
-              <w:right w:type="dxa" w:w="90"/>
-            </w:tcMar>
-            <w:vAlign w:val="center"/>
-          </w:tcPr>
-          <w:p>
-            <w:pPr>
-              <w:spacing w:after="0" w:line="250"/>
-            </w:pPr>
-            <w:r>
-              <w:rPr>
-                <w:rFonts w:ascii="Arial" w:cs="Arial" w:eastAsia="Arial" w:hAnsi="Arial"/>
-                <w:sz w:val="16"/>
-                <w:szCs w:val="16"/>
-              </w:rPr>
-              <w:t xml:space="preserve">O reaproveitamento se limita ao modelo de dados e à especificação da API. O MultiPag não é uma solução white label, então grande parte do código será específica.</w:t>
-            </w:r>
-          </w:p>
-        </w:tc>
-      </w:tr>
-      <w:tr>
-        <w:trPr>
-          <w:cantSplit/>
-        </w:trPr>
-        <w:tc>
-          <w:tcPr>
-            <w:tcW w:type="dxa" w:w="500"/>
-            <w:tcBorders>
-              <w:top w:val="single" w:color="A6A6A6" w:sz="4"/>
-              <w:left w:val="single" w:color="A6A6A6" w:sz="4"/>
-              <w:bottom w:val="single" w:color="A6A6A6" w:sz="4"/>
-              <w:right w:val="single" w:color="A6A6A6" w:sz="4"/>
-            </w:tcBorders>
-            <w:tcMar>
-              <w:top w:type="dxa" w:w="45"/>
-              <w:left w:type="dxa" w:w="90"/>
-              <w:bottom w:type="dxa" w:w="45"/>
-              <w:right w:type="dxa" w:w="90"/>
-            </w:tcMar>
-            <w:vAlign w:val="center"/>
-          </w:tcPr>
-          <w:p>
-            <w:pPr>
-              <w:spacing w:after="0" w:line="250"/>
-              <w:jc w:val="center"/>
-            </w:pPr>
-            <w:r>
-              <w:rPr>
-                <w:rFonts w:ascii="Arial" w:cs="Arial" w:eastAsia="Arial" w:hAnsi="Arial"/>
-                <w:sz w:val="18"/>
-                <w:szCs w:val="18"/>
-              </w:rPr>
-              <w:t xml:space="preserve">11</w:t>
-            </w:r>
-          </w:p>
-        </w:tc>
-        <w:tc>
-          <w:tcPr>
-            <w:tcW w:type="dxa" w:w="2500"/>
-            <w:tcBorders>
-              <w:top w:val="single" w:color="A6A6A6" w:sz="4"/>
-              <w:left w:val="single" w:color="A6A6A6" w:sz="4"/>
-              <w:bottom w:val="single" w:color="A6A6A6" w:sz="4"/>
-              <w:right w:val="single" w:color="A6A6A6" w:sz="4"/>
-            </w:tcBorders>
-            <w:tcMar>
-              <w:top w:type="dxa" w:w="30"/>
-              <w:left w:type="dxa" w:w="90"/>
-              <w:bottom w:type="dxa" w:w="30"/>
-              <w:right w:type="dxa" w:w="90"/>
-            </w:tcMar>
-            <w:vAlign w:val="center"/>
-          </w:tcPr>
-          <w:p>
-            <w:pPr>
-              <w:spacing w:after="0" w:line="250"/>
-            </w:pPr>
-            <w:r>
-              <w:rPr>
-                <w:rFonts w:ascii="Arial" w:cs="Arial" w:eastAsia="Arial" w:hAnsi="Arial"/>
-                <w:b/>
-                <w:bCs/>
-                <w:sz w:val="18"/>
-                <w:szCs w:val="18"/>
-              </w:rPr>
-              <w:t xml:space="preserve">Facilidade de implantação</w:t>
-            </w:r>
-          </w:p>
-        </w:tc>
-        <w:tc>
-          <w:tcPr>
-            <w:tcW w:type="dxa" w:w="700"/>
-            <w:tcBorders>
-              <w:top w:val="single" w:color="A6A6A6" w:sz="4"/>
-              <w:left w:val="single" w:color="A6A6A6" w:sz="4"/>
-              <w:bottom w:val="single" w:color="A6A6A6" w:sz="4"/>
-              <w:right w:val="single" w:color="A6A6A6" w:sz="4"/>
-            </w:tcBorders>
-            <w:tcMar>
-              <w:top w:type="dxa" w:w="30"/>
-              <w:left w:type="dxa" w:w="90"/>
-              <w:bottom w:type="dxa" w:w="30"/>
-              <w:right w:type="dxa" w:w="90"/>
-            </w:tcMar>
-            <w:vAlign w:val="center"/>
-          </w:tcPr>
-          <w:p>
-            <w:pPr>
-              <w:spacing w:after="0" w:line="250"/>
-              <w:jc w:val="center"/>
-            </w:pPr>
-            <w:r>
-              <w:rPr>
-                <w:rFonts w:ascii="Arial" w:cs="Arial" w:eastAsia="Arial" w:hAnsi="Arial"/>
-                <w:b/>
-                <w:bCs/>
-                <w:sz w:val="18"/>
-                <w:szCs w:val="18"/>
-              </w:rPr>
-              <w:t xml:space="preserve">2</w:t>
-            </w:r>
-          </w:p>
-        </w:tc>
-        <w:tc>
-          <w:tcPr>
-            <w:tcW w:type="dxa" w:w="5938"/>
-            <w:tcBorders>
-              <w:top w:val="single" w:color="A6A6A6" w:sz="4"/>
-              <w:left w:val="single" w:color="A6A6A6" w:sz="4"/>
-              <w:bottom w:val="single" w:color="A6A6A6" w:sz="4"/>
-              <w:right w:val="single" w:color="A6A6A6" w:sz="4"/>
-            </w:tcBorders>
-            <w:tcMar>
-              <w:top w:type="dxa" w:w="30"/>
-              <w:left w:type="dxa" w:w="90"/>
-              <w:bottom w:type="dxa" w:w="30"/>
-              <w:right w:type="dxa" w:w="90"/>
-            </w:tcMar>
-            <w:vAlign w:val="center"/>
-          </w:tcPr>
-          <w:p>
-            <w:pPr>
-              <w:spacing w:after="0" w:line="250"/>
-            </w:pPr>
-            <w:r>
-              <w:rPr>
-                <w:rFonts w:ascii="Arial" w:cs="Arial" w:eastAsia="Arial" w:hAnsi="Arial"/>
-                <w:sz w:val="16"/>
-                <w:szCs w:val="16"/>
-              </w:rPr>
-              <w:t xml:space="preserve">A publicação em nuvem é simples, mas a implantação exige configurar as integrações com os gateways e cadastrar os businesses iniciais, sem requisito formal de conversão de dados.</w:t>
-            </w:r>
-          </w:p>
-        </w:tc>
-      </w:tr>
-      <w:tr>
-        <w:trPr>
-          <w:cantSplit/>
-        </w:trPr>
-        <w:tc>
-          <w:tcPr>
-            <w:tcW w:type="dxa" w:w="500"/>
-            <w:tcBorders>
-              <w:top w:val="single" w:color="A6A6A6" w:sz="4"/>
-              <w:left w:val="single" w:color="A6A6A6" w:sz="4"/>
-              <w:bottom w:val="single" w:color="A6A6A6" w:sz="4"/>
-              <w:right w:val="single" w:color="A6A6A6" w:sz="4"/>
-            </w:tcBorders>
-            <w:tcMar>
-              <w:top w:type="dxa" w:w="45"/>
-              <w:left w:type="dxa" w:w="90"/>
-              <w:bottom w:type="dxa" w:w="45"/>
-              <w:right w:type="dxa" w:w="90"/>
-            </w:tcMar>
-            <w:vAlign w:val="center"/>
-          </w:tcPr>
-          <w:p>
-            <w:pPr>
-              <w:spacing w:after="0" w:line="250"/>
-              <w:jc w:val="center"/>
-            </w:pPr>
-            <w:r>
-              <w:rPr>
-                <w:rFonts w:ascii="Arial" w:cs="Arial" w:eastAsia="Arial" w:hAnsi="Arial"/>
-                <w:sz w:val="18"/>
-                <w:szCs w:val="18"/>
-              </w:rPr>
-              <w:t xml:space="preserve">12</w:t>
-            </w:r>
-          </w:p>
-        </w:tc>
-        <w:tc>
-          <w:tcPr>
-            <w:tcW w:type="dxa" w:w="2500"/>
-            <w:tcBorders>
-              <w:top w:val="single" w:color="A6A6A6" w:sz="4"/>
-              <w:left w:val="single" w:color="A6A6A6" w:sz="4"/>
-              <w:bottom w:val="single" w:color="A6A6A6" w:sz="4"/>
-              <w:right w:val="single" w:color="A6A6A6" w:sz="4"/>
-            </w:tcBorders>
-            <w:tcMar>
-              <w:top w:type="dxa" w:w="30"/>
-              <w:left w:type="dxa" w:w="90"/>
-              <w:bottom w:type="dxa" w:w="30"/>
-              <w:right w:type="dxa" w:w="90"/>
-            </w:tcMar>
-            <w:vAlign w:val="center"/>
-          </w:tcPr>
-          <w:p>
-            <w:pPr>
-              <w:spacing w:after="0" w:line="250"/>
-            </w:pPr>
-            <w:r>
-              <w:rPr>
-                <w:rFonts w:ascii="Arial" w:cs="Arial" w:eastAsia="Arial" w:hAnsi="Arial"/>
-                <w:b/>
-                <w:bCs/>
-                <w:sz w:val="18"/>
-                <w:szCs w:val="18"/>
-              </w:rPr>
-              <w:t xml:space="preserve">Facilidade operacional</w:t>
-            </w:r>
-          </w:p>
-        </w:tc>
-        <w:tc>
-          <w:tcPr>
-            <w:tcW w:type="dxa" w:w="700"/>
-            <w:tcBorders>
-              <w:top w:val="single" w:color="A6A6A6" w:sz="4"/>
-              <w:left w:val="single" w:color="A6A6A6" w:sz="4"/>
-              <w:bottom w:val="single" w:color="A6A6A6" w:sz="4"/>
-              <w:right w:val="single" w:color="A6A6A6" w:sz="4"/>
-            </w:tcBorders>
-            <w:tcMar>
-              <w:top w:type="dxa" w:w="30"/>
-              <w:left w:type="dxa" w:w="90"/>
-              <w:bottom w:type="dxa" w:w="30"/>
-              <w:right w:type="dxa" w:w="90"/>
-            </w:tcMar>
-            <w:vAlign w:val="center"/>
-          </w:tcPr>
-          <w:p>
-            <w:pPr>
-              <w:spacing w:after="0" w:line="250"/>
-              <w:jc w:val="center"/>
-            </w:pPr>
-            <w:r>
-              <w:rPr>
-                <w:rFonts w:ascii="Arial" w:cs="Arial" w:eastAsia="Arial" w:hAnsi="Arial"/>
-                <w:b/>
-                <w:bCs/>
-                <w:sz w:val="18"/>
-                <w:szCs w:val="18"/>
-              </w:rPr>
-              <w:t xml:space="preserve">3</w:t>
-            </w:r>
-          </w:p>
-        </w:tc>
-        <w:tc>
-          <w:tcPr>
-            <w:tcW w:type="dxa" w:w="5938"/>
-            <w:tcBorders>
-              <w:top w:val="single" w:color="A6A6A6" w:sz="4"/>
-              <w:left w:val="single" w:color="A6A6A6" w:sz="4"/>
-              <w:bottom w:val="single" w:color="A6A6A6" w:sz="4"/>
-              <w:right w:val="single" w:color="A6A6A6" w:sz="4"/>
-            </w:tcBorders>
-            <w:tcMar>
-              <w:top w:type="dxa" w:w="30"/>
-              <w:left w:type="dxa" w:w="90"/>
-              <w:bottom w:type="dxa" w:w="30"/>
-              <w:right w:type="dxa" w:w="90"/>
-            </w:tcMar>
-            <w:vAlign w:val="center"/>
-          </w:tcPr>
-          <w:p>
-            <w:pPr>
-              <w:spacing w:after="0" w:line="250"/>
-            </w:pPr>
-            <w:r>
-              <w:rPr>
-                <w:rFonts w:ascii="Arial" w:cs="Arial" w:eastAsia="Arial" w:hAnsi="Arial"/>
-                <w:sz w:val="16"/>
-                <w:szCs w:val="16"/>
-              </w:rPr>
-              <w:t xml:space="preserve">A operação depende de rotinas de backup, registro de transações (RNF09) e acompanhamento da confirmação dos pagamentos, com algum procedimento manual quando um gateway falha.</w:t>
-            </w:r>
-          </w:p>
-        </w:tc>
-      </w:tr>
-      <w:tr>
-        <w:trPr>
-          <w:cantSplit/>
-        </w:trPr>
-        <w:tc>
-          <w:tcPr>
-            <w:tcW w:type="dxa" w:w="500"/>
-            <w:tcBorders>
-              <w:top w:val="single" w:color="A6A6A6" w:sz="4"/>
-              <w:left w:val="single" w:color="A6A6A6" w:sz="4"/>
-              <w:bottom w:val="single" w:color="A6A6A6" w:sz="4"/>
-              <w:right w:val="single" w:color="A6A6A6" w:sz="4"/>
-            </w:tcBorders>
-            <w:tcMar>
-              <w:top w:type="dxa" w:w="45"/>
-              <w:left w:type="dxa" w:w="90"/>
-              <w:bottom w:type="dxa" w:w="45"/>
-              <w:right w:type="dxa" w:w="90"/>
-            </w:tcMar>
-            <w:vAlign w:val="center"/>
-          </w:tcPr>
-          <w:p>
-            <w:pPr>
-              <w:spacing w:after="0" w:line="250"/>
-              <w:jc w:val="center"/>
-            </w:pPr>
-            <w:r>
-              <w:rPr>
-                <w:rFonts w:ascii="Arial" w:cs="Arial" w:eastAsia="Arial" w:hAnsi="Arial"/>
-                <w:sz w:val="18"/>
-                <w:szCs w:val="18"/>
-              </w:rPr>
-              <w:t xml:space="preserve">13</w:t>
-            </w:r>
-          </w:p>
-        </w:tc>
-        <w:tc>
-          <w:tcPr>
-            <w:tcW w:type="dxa" w:w="2500"/>
-            <w:tcBorders>
-              <w:top w:val="single" w:color="A6A6A6" w:sz="4"/>
-              <w:left w:val="single" w:color="A6A6A6" w:sz="4"/>
-              <w:bottom w:val="single" w:color="A6A6A6" w:sz="4"/>
-              <w:right w:val="single" w:color="A6A6A6" w:sz="4"/>
-            </w:tcBorders>
-            <w:tcMar>
-              <w:top w:type="dxa" w:w="30"/>
-              <w:left w:type="dxa" w:w="90"/>
-              <w:bottom w:type="dxa" w:w="30"/>
-              <w:right w:type="dxa" w:w="90"/>
-            </w:tcMar>
-            <w:vAlign w:val="center"/>
-          </w:tcPr>
-          <w:p>
-            <w:pPr>
-              <w:spacing w:after="0" w:line="250"/>
-            </w:pPr>
-            <w:r>
-              <w:rPr>
-                <w:rFonts w:ascii="Arial" w:cs="Arial" w:eastAsia="Arial" w:hAnsi="Arial"/>
-                <w:b/>
-                <w:bCs/>
-                <w:sz w:val="18"/>
-                <w:szCs w:val="18"/>
-              </w:rPr>
-              <w:t xml:space="preserve">Múltiplos locais</w:t>
-            </w:r>
-          </w:p>
-        </w:tc>
-        <w:tc>
-          <w:tcPr>
-            <w:tcW w:type="dxa" w:w="700"/>
-            <w:tcBorders>
-              <w:top w:val="single" w:color="A6A6A6" w:sz="4"/>
-              <w:left w:val="single" w:color="A6A6A6" w:sz="4"/>
-              <w:bottom w:val="single" w:color="A6A6A6" w:sz="4"/>
-              <w:right w:val="single" w:color="A6A6A6" w:sz="4"/>
-            </w:tcBorders>
-            <w:tcMar>
-              <w:top w:type="dxa" w:w="30"/>
-              <w:left w:type="dxa" w:w="90"/>
-              <w:bottom w:type="dxa" w:w="30"/>
-              <w:right w:type="dxa" w:w="90"/>
-            </w:tcMar>
-            <w:vAlign w:val="center"/>
-          </w:tcPr>
-          <w:p>
-            <w:pPr>
-              <w:spacing w:after="0" w:line="250"/>
-              <w:jc w:val="center"/>
-            </w:pPr>
-            <w:r>
-              <w:rPr>
-                <w:rFonts w:ascii="Arial" w:cs="Arial" w:eastAsia="Arial" w:hAnsi="Arial"/>
-                <w:b/>
-                <w:bCs/>
-                <w:sz w:val="18"/>
-                <w:szCs w:val="18"/>
-              </w:rPr>
-              <w:t xml:space="preserve">3</w:t>
-            </w:r>
-          </w:p>
-        </w:tc>
-        <w:tc>
-          <w:tcPr>
-            <w:tcW w:type="dxa" w:w="5938"/>
-            <w:tcBorders>
-              <w:top w:val="single" w:color="A6A6A6" w:sz="4"/>
-              <w:left w:val="single" w:color="A6A6A6" w:sz="4"/>
-              <w:bottom w:val="single" w:color="A6A6A6" w:sz="4"/>
-              <w:right w:val="single" w:color="A6A6A6" w:sz="4"/>
-            </w:tcBorders>
-            <w:tcMar>
-              <w:top w:type="dxa" w:w="30"/>
-              <w:left w:type="dxa" w:w="90"/>
-              <w:bottom w:type="dxa" w:w="30"/>
-              <w:right w:type="dxa" w:w="90"/>
-            </w:tcMar>
-            <w:vAlign w:val="center"/>
-          </w:tcPr>
-          <w:p>
-            <w:pPr>
-              <w:spacing w:after="0" w:line="250"/>
-            </w:pPr>
-            <w:r>
-              <w:rPr>
-                <w:rFonts w:ascii="Arial" w:cs="Arial" w:eastAsia="Arial" w:hAnsi="Arial"/>
-                <w:sz w:val="16"/>
-                <w:szCs w:val="16"/>
-              </w:rPr>
-              <w:t xml:space="preserve">Uma única instalação atende vários businesses e clientes que acessam de lugares e dispositivos diferentes, mas sem instalações separadas em locais distintos.</w:t>
-            </w:r>
-          </w:p>
-        </w:tc>
-      </w:tr>
-      <w:tr>
-        <w:trPr>
-          <w:cantSplit/>
-        </w:trPr>
-        <w:tc>
-          <w:tcPr>
-            <w:tcW w:type="dxa" w:w="500"/>
-            <w:tcBorders>
-              <w:top w:val="single" w:color="A6A6A6" w:sz="4"/>
-              <w:left w:val="single" w:color="A6A6A6" w:sz="4"/>
-              <w:bottom w:val="single" w:color="A6A6A6" w:sz="4"/>
-              <w:right w:val="single" w:color="A6A6A6" w:sz="4"/>
-            </w:tcBorders>
-            <w:tcMar>
-              <w:top w:type="dxa" w:w="45"/>
-              <w:left w:type="dxa" w:w="90"/>
-              <w:bottom w:type="dxa" w:w="45"/>
-              <w:right w:type="dxa" w:w="90"/>
-            </w:tcMar>
-            <w:vAlign w:val="center"/>
-          </w:tcPr>
-          <w:p>
-            <w:pPr>
-              <w:spacing w:after="0" w:line="250"/>
-              <w:jc w:val="center"/>
-            </w:pPr>
-            <w:r>
-              <w:rPr>
-                <w:rFonts w:ascii="Arial" w:cs="Arial" w:eastAsia="Arial" w:hAnsi="Arial"/>
-                <w:sz w:val="18"/>
-                <w:szCs w:val="18"/>
-              </w:rPr>
-              <w:t xml:space="preserve">14</w:t>
-            </w:r>
-          </w:p>
-        </w:tc>
-        <w:tc>
-          <w:tcPr>
-            <w:tcW w:type="dxa" w:w="2500"/>
-            <w:tcBorders>
-              <w:top w:val="single" w:color="A6A6A6" w:sz="4"/>
-              <w:left w:val="single" w:color="A6A6A6" w:sz="4"/>
-              <w:bottom w:val="single" w:color="A6A6A6" w:sz="4"/>
-              <w:right w:val="single" w:color="A6A6A6" w:sz="4"/>
-            </w:tcBorders>
-            <w:tcMar>
-              <w:top w:type="dxa" w:w="30"/>
-              <w:left w:type="dxa" w:w="90"/>
-              <w:bottom w:type="dxa" w:w="30"/>
-              <w:right w:type="dxa" w:w="90"/>
-            </w:tcMar>
-            <w:vAlign w:val="center"/>
-          </w:tcPr>
-          <w:p>
-            <w:pPr>
-              <w:spacing w:after="0" w:line="250"/>
-            </w:pPr>
-            <w:r>
-              <w:rPr>
-                <w:rFonts w:ascii="Arial" w:cs="Arial" w:eastAsia="Arial" w:hAnsi="Arial"/>
-                <w:b/>
-                <w:bCs/>
-                <w:sz w:val="18"/>
-                <w:szCs w:val="18"/>
-              </w:rPr>
-              <w:t xml:space="preserve">Facilidade de mudanças</w:t>
-            </w:r>
-          </w:p>
-        </w:tc>
-        <w:tc>
-          <w:tcPr>
-            <w:tcW w:type="dxa" w:w="700"/>
-            <w:tcBorders>
-              <w:top w:val="single" w:color="A6A6A6" w:sz="4"/>
-              <w:left w:val="single" w:color="A6A6A6" w:sz="4"/>
-              <w:bottom w:val="single" w:color="A6A6A6" w:sz="4"/>
-              <w:right w:val="single" w:color="A6A6A6" w:sz="4"/>
-            </w:tcBorders>
-            <w:tcMar>
-              <w:top w:type="dxa" w:w="30"/>
-              <w:left w:type="dxa" w:w="90"/>
-              <w:bottom w:type="dxa" w:w="30"/>
-              <w:right w:type="dxa" w:w="90"/>
-            </w:tcMar>
-            <w:vAlign w:val="center"/>
-          </w:tcPr>
-          <w:p>
-            <w:pPr>
-              <w:spacing w:after="0" w:line="250"/>
-              <w:jc w:val="center"/>
-            </w:pPr>
-            <w:r>
-              <w:rPr>
-                <w:rFonts w:ascii="Arial" w:cs="Arial" w:eastAsia="Arial" w:hAnsi="Arial"/>
-                <w:b/>
-                <w:bCs/>
-                <w:sz w:val="18"/>
-                <w:szCs w:val="18"/>
-              </w:rPr>
-              <w:t xml:space="preserve">2</w:t>
-            </w:r>
-          </w:p>
-        </w:tc>
-        <w:tc>
-          <w:tcPr>
-            <w:tcW w:type="dxa" w:w="5938"/>
-            <w:tcBorders>
-              <w:top w:val="single" w:color="A6A6A6" w:sz="4"/>
-              <w:left w:val="single" w:color="A6A6A6" w:sz="4"/>
-              <w:bottom w:val="single" w:color="A6A6A6" w:sz="4"/>
-              <w:right w:val="single" w:color="A6A6A6" w:sz="4"/>
-            </w:tcBorders>
-            <w:tcMar>
-              <w:top w:type="dxa" w:w="30"/>
-              <w:left w:type="dxa" w:w="90"/>
-              <w:bottom w:type="dxa" w:w="30"/>
-              <w:right w:type="dxa" w:w="90"/>
-            </w:tcMar>
-            <w:vAlign w:val="center"/>
-          </w:tcPr>
-          <w:p>
-            <w:pPr>
-              <w:spacing w:after="0" w:line="250"/>
-            </w:pPr>
-            <w:r>
-              <w:rPr>
-                <w:rFonts w:ascii="Arial" w:cs="Arial" w:eastAsia="Arial" w:hAnsi="Arial"/>
-                <w:sz w:val="16"/>
-                <w:szCs w:val="16"/>
-              </w:rPr>
-              <w:t xml:space="preserve">As regras ficam no código, e um novo método de pagamento ou novo tipo de cobrança exige alteração pontual. O usuário só configura filtros e os métodos habilitados de cada cobrança.</w:t>
-            </w:r>
-          </w:p>
-        </w:tc>
-      </w:tr>
-      <w:tr>
-        <w:tc>
-          <w:tcPr>
-            <w:tcW w:type="dxa" w:w="3000"/>
-            <w:gridSpan w:val="2"/>
-            <w:tcBorders>
-              <w:top w:val="single" w:color="A6A6A6" w:sz="4"/>
-              <w:left w:val="single" w:color="A6A6A6" w:sz="4"/>
-              <w:bottom w:val="single" w:color="A6A6A6" w:sz="4"/>
-              <w:right w:val="single" w:color="A6A6A6" w:sz="4"/>
-            </w:tcBorders>
-            <w:shd w:fill="E7E6E6" w:color="auto" w:val="clear"/>
-            <w:tcMar>
-              <w:top w:type="dxa" w:w="45"/>
-              <w:left w:type="dxa" w:w="90"/>
-              <w:bottom w:type="dxa" w:w="45"/>
-              <w:right w:type="dxa" w:w="90"/>
-            </w:tcMar>
-            <w:vAlign w:val="center"/>
-          </w:tcPr>
-          <w:p>
-            <w:pPr>
-              <w:spacing w:after="0" w:line="250"/>
-            </w:pPr>
-            <w:r>
-              <w:rPr>
-                <w:rFonts w:ascii="Arial" w:cs="Arial" w:eastAsia="Arial" w:hAnsi="Arial"/>
-                <w:b/>
-                <w:bCs/>
-                <w:sz w:val="18"/>
-                <w:szCs w:val="18"/>
-              </w:rPr>
-              <w:t xml:space="preserve">Nível de influência (NI)</w:t>
-            </w:r>
-          </w:p>
-        </w:tc>
-        <w:tc>
-          <w:tcPr>
-            <w:tcW w:type="dxa" w:w="700"/>
-            <w:tcBorders>
-              <w:top w:val="single" w:color="A6A6A6" w:sz="4"/>
-              <w:left w:val="single" w:color="A6A6A6" w:sz="4"/>
-              <w:bottom w:val="single" w:color="A6A6A6" w:sz="4"/>
-              <w:right w:val="single" w:color="A6A6A6" w:sz="4"/>
-            </w:tcBorders>
-            <w:shd w:fill="E7E6E6" w:color="auto" w:val="clear"/>
-            <w:tcMar>
-              <w:top w:type="dxa" w:w="45"/>
-              <w:left w:type="dxa" w:w="90"/>
-              <w:bottom w:type="dxa" w:w="45"/>
-              <w:right w:type="dxa" w:w="90"/>
-            </w:tcMar>
-            <w:vAlign w:val="center"/>
-          </w:tcPr>
-          <w:p>
-            <w:pPr>
-              <w:spacing w:after="0" w:line="250"/>
-              <w:jc w:val="center"/>
-            </w:pPr>
-            <w:r>
-              <w:rPr>
-                <w:rFonts w:ascii="Arial" w:cs="Arial" w:eastAsia="Arial" w:hAnsi="Arial"/>
-                <w:b/>
-                <w:bCs/>
-                <w:sz w:val="18"/>
-                <w:szCs w:val="18"/>
-              </w:rPr>
-              <w:t xml:space="preserve">42</w:t>
-            </w:r>
-          </w:p>
-        </w:tc>
-        <w:tc>
-          <w:tcPr>
-            <w:tcW w:type="dxa" w:w="5938"/>
-            <w:tcBorders>
-              <w:top w:val="single" w:color="A6A6A6" w:sz="4"/>
-              <w:left w:val="single" w:color="A6A6A6" w:sz="4"/>
-              <w:bottom w:val="single" w:color="A6A6A6" w:sz="4"/>
-              <w:right w:val="single" w:color="A6A6A6" w:sz="4"/>
-            </w:tcBorders>
-            <w:shd w:fill="E7E6E6" w:color="auto" w:val="clear"/>
-            <w:tcMar>
-              <w:top w:type="dxa" w:w="45"/>
-              <w:left w:type="dxa" w:w="90"/>
-              <w:bottom w:type="dxa" w:w="45"/>
-              <w:right w:type="dxa" w:w="90"/>
-            </w:tcMar>
-            <w:vAlign w:val="center"/>
-          </w:tcPr>
-          <w:p>
-            <w:pPr>
-              <w:spacing w:after="0" w:line="250"/>
-            </w:pPr>
-            <w:r>
-              <w:rPr>
-                <w:rFonts w:ascii="Arial" w:cs="Arial" w:eastAsia="Arial" w:hAnsi="Arial"/>
-                <w:sz w:val="18"/>
-                <w:szCs w:val="18"/>
-              </w:rPr>
-              <w:t xml:space="preserve"/>
-            </w:r>
-          </w:p>
-        </w:tc>
-      </w:tr>
-    </w:tbl>
-    <w:p>
-      <w:pPr>
-        <w:pStyle w:val="Heading2"/>
-        <w:keepNext/>
-        <w:spacing w:after="80" w:before="200"/>
-      </w:pPr>
-      <w:r>
-        <w:rPr>
-          <w:rFonts w:ascii="Arial" w:cs="Arial" w:eastAsia="Arial" w:hAnsi="Arial"/>
-          <w:b/>
-          <w:bCs/>
-          <w:color w:val="2F5496"/>
-          <w:sz w:val="24"/>
-          <w:szCs w:val="24"/>
-        </w:rPr>
-        <w:t xml:space="preserve">6.3 Fator de ajuste (FA) e pontos de função ajustados (PFA)</w:t>
-      </w:r>
-    </w:p>
-    <w:p>
-      <w:pPr>
-        <w:spacing w:after="60" w:before="0" w:line="276"/>
-      </w:pPr>
-      <w:r>
-        <w:rPr>
-          <w:rFonts w:ascii="Arial" w:cs="Arial" w:eastAsia="Arial" w:hAnsi="Arial"/>
-          <w:sz w:val="21"/>
-          <w:szCs w:val="21"/>
-        </w:rPr>
-        <w:t xml:space="preserve">FA = 0,65 + (0,01 × NI) = 0,65 + (0,01 × 42) = 1,07</w:t>
-      </w:r>
-    </w:p>
-    <w:p>
-      <w:pPr>
-        <w:spacing w:after="100" w:before="0" w:line="276"/>
-      </w:pPr>
-      <w:r>
-        <w:rPr>
-          <w:rFonts w:ascii="Arial" w:cs="Arial" w:eastAsia="Arial" w:hAnsi="Arial"/>
-          <w:sz w:val="21"/>
-          <w:szCs w:val="21"/>
-        </w:rPr>
-        <w:t xml:space="preserve">PFA = PFB × FA = 173 × 1,07 = 185,11 PF</w:t>
-      </w:r>
-    </w:p>
-    <w:p>
-      <w:pPr>
-        <w:pStyle w:val="Heading1"/>
-        <w:keepNext/>
-        <w:pageBreakBefore/>
-        <w:spacing w:after="160" w:before="0"/>
-      </w:pPr>
-      <w:r>
-        <w:rPr>
-          <w:rFonts w:ascii="Arial" w:cs="Arial" w:eastAsia="Arial" w:hAnsi="Arial"/>
-          <w:b/>
-          <w:bCs/>
-          <w:color w:val="1F3864"/>
-          <w:sz w:val="30"/>
-          <w:szCs w:val="30"/>
-        </w:rPr>
-        <w:t xml:space="preserve">7. Esforço, prazo e custo</w:t>
-      </w:r>
-    </w:p>
-    <w:p>
-      <w:pPr>
-        <w:spacing w:after="70" w:line="264"/>
-      </w:pPr>
-      <w:r>
-        <w:rPr>
-          <w:rFonts w:ascii="Arial" w:cs="Arial" w:eastAsia="Arial" w:hAnsi="Arial"/>
-          <w:b/>
-          <w:bCs/>
-          <w:sz w:val="20"/>
-          <w:szCs w:val="20"/>
-        </w:rPr>
-        <w:t xml:space="preserve">Produtividade: </w:t>
-      </w:r>
-      <w:r>
-        <w:rPr>
-          <w:rFonts w:ascii="Arial" w:cs="Arial" w:eastAsia="Arial" w:hAnsi="Arial"/>
-          <w:sz w:val="20"/>
-          <w:szCs w:val="20"/>
-        </w:rPr>
-        <w:t xml:space="preserve">12 horas por PF</w:t>
-      </w:r>
-    </w:p>
-    <w:p>
-      <w:pPr>
-        <w:spacing w:after="70" w:line="264"/>
-      </w:pPr>
-      <w:r>
-        <w:rPr>
-          <w:rFonts w:ascii="Arial" w:cs="Arial" w:eastAsia="Arial" w:hAnsi="Arial"/>
-          <w:b/>
-          <w:bCs/>
-          <w:sz w:val="20"/>
-          <w:szCs w:val="20"/>
-        </w:rPr>
-        <w:t xml:space="preserve">Custo da hora: </w:t>
-      </w:r>
-      <w:r>
-        <w:rPr>
-          <w:rFonts w:ascii="Arial" w:cs="Arial" w:eastAsia="Arial" w:hAnsi="Arial"/>
-          <w:sz w:val="20"/>
-          <w:szCs w:val="20"/>
-        </w:rPr>
-        <w:t xml:space="preserve">R$ 50,00</w:t>
-      </w:r>
-    </w:p>
-    <w:p>
-      <w:pPr>
-        <w:spacing w:after="70" w:line="264"/>
-      </w:pPr>
-      <w:r>
-        <w:rPr>
-          <w:rFonts w:ascii="Arial" w:cs="Arial" w:eastAsia="Arial" w:hAnsi="Arial"/>
-          <w:b/>
-          <w:bCs/>
-          <w:sz w:val="20"/>
-          <w:szCs w:val="20"/>
-        </w:rPr>
-        <w:t xml:space="preserve">Equipe e dedicação: </w:t>
-      </w:r>
-      <w:r>
-        <w:rPr>
-          <w:rFonts w:ascii="Arial" w:cs="Arial" w:eastAsia="Arial" w:hAnsi="Arial"/>
-          <w:sz w:val="20"/>
-          <w:szCs w:val="20"/>
-        </w:rPr>
-        <w:t xml:space="preserve">3 desenvolvedores, 4 horas por dia, 20 dias úteis por mês</w:t>
-      </w:r>
-    </w:p>
-    <w:p>
-      <w:pPr>
-        <w:spacing w:after="60" w:before="0" w:line="276"/>
-      </w:pPr>
-      <w:r>
-        <w:rPr>
-          <w:rFonts w:ascii="Arial" w:cs="Arial" w:eastAsia="Arial" w:hAnsi="Arial"/>
-          <w:sz w:val="21"/>
-          <w:szCs w:val="21"/>
-        </w:rPr>
-        <w:t xml:space="preserve"/>
-      </w:r>
-    </w:p>
-    <w:p>
-      <w:pPr>
-        <w:spacing w:after="50" w:before="0" w:line="276"/>
-      </w:pPr>
-      <w:r>
-        <w:rPr>
-          <w:rFonts w:ascii="Arial" w:cs="Arial" w:eastAsia="Arial" w:hAnsi="Arial"/>
-          <w:sz w:val="21"/>
-          <w:szCs w:val="21"/>
-        </w:rPr>
-        <w:t xml:space="preserve">Esforço = PFA × produtividade = 185,11 × 12 = 2.221,3 horas</w:t>
-      </w:r>
-    </w:p>
-    <w:p>
-      <w:pPr>
-        <w:spacing w:after="50" w:before="0" w:line="276"/>
-      </w:pPr>
-      <w:r>
-        <w:rPr>
-          <w:rFonts w:ascii="Arial" w:cs="Arial" w:eastAsia="Arial" w:hAnsi="Arial"/>
-          <w:sz w:val="21"/>
-          <w:szCs w:val="21"/>
-        </w:rPr>
-        <w:t xml:space="preserve">Prazo = esforço ÷ (3 × 4 × 20) = 2.221,3 ÷ 240 = 9,3 meses</w:t>
-      </w:r>
-    </w:p>
-    <w:p>
-      <w:pPr>
-        <w:spacing w:after="100" w:before="0" w:line="276"/>
-      </w:pPr>
-      <w:r>
-        <w:rPr>
-          <w:rFonts w:ascii="Arial" w:cs="Arial" w:eastAsia="Arial" w:hAnsi="Arial"/>
-          <w:sz w:val="21"/>
-          <w:szCs w:val="21"/>
-        </w:rPr>
-        <w:t xml:space="preserve">Custo = esforço × custo da hora = 2.221,3 × R$ 50,00 = R$ 111.066,00</w:t>
       </w:r>
     </w:p>
     <w:sectPr>

</xml_diff>